<commit_message>
updated my .docx and .pdf
</commit_message>
<xml_diff>
--- a/BCS 404 INTRODUCTION TO DATA SCIENCE REPORT.docx
+++ b/BCS 404 INTRODUCTION TO DATA SCIENCE REPORT.docx
@@ -801,122 +801,15 @@
           <w:szCs w:val="24"/>
         </w:rPr>
       </w:pPr>
-    </w:p>
-    <w:p>
-      <w:pPr>
-        <w:ind w:left="-5"/>
-        <w:rPr>
-          <w:sz w:val="24"/>
-          <w:szCs w:val="24"/>
-        </w:rPr>
-      </w:pPr>
-    </w:p>
-    <w:p>
-      <w:pPr>
-        <w:ind w:left="-5"/>
-        <w:rPr>
-          <w:sz w:val="24"/>
-          <w:szCs w:val="24"/>
-        </w:rPr>
-      </w:pPr>
-    </w:p>
-    <w:p>
-      <w:pPr>
-        <w:ind w:left="-5"/>
-        <w:rPr>
-          <w:sz w:val="24"/>
-          <w:szCs w:val="24"/>
-        </w:rPr>
-      </w:pPr>
-    </w:p>
-    <w:p>
-      <w:pPr>
-        <w:ind w:left="-5"/>
-        <w:rPr>
-          <w:sz w:val="24"/>
-          <w:szCs w:val="24"/>
-        </w:rPr>
-      </w:pPr>
-    </w:p>
-    <w:p>
-      <w:pPr>
-        <w:ind w:left="-5"/>
-        <w:rPr>
-          <w:sz w:val="24"/>
-          <w:szCs w:val="24"/>
-        </w:rPr>
-      </w:pPr>
-    </w:p>
-    <w:p>
-      <w:pPr>
-        <w:ind w:left="-5"/>
-        <w:rPr>
-          <w:sz w:val="24"/>
-          <w:szCs w:val="24"/>
-        </w:rPr>
-      </w:pPr>
-    </w:p>
-    <w:p>
-      <w:pPr>
-        <w:ind w:left="-5"/>
-        <w:rPr>
-          <w:sz w:val="24"/>
-          <w:szCs w:val="24"/>
-        </w:rPr>
-      </w:pPr>
-    </w:p>
-    <w:p>
-      <w:pPr>
-        <w:ind w:left="-5"/>
-        <w:rPr>
-          <w:sz w:val="24"/>
-          <w:szCs w:val="24"/>
-        </w:rPr>
-      </w:pPr>
-    </w:p>
-    <w:p>
-      <w:pPr>
-        <w:ind w:left="-5"/>
-        <w:rPr>
-          <w:sz w:val="24"/>
-          <w:szCs w:val="24"/>
-        </w:rPr>
-      </w:pPr>
-    </w:p>
-    <w:p>
-      <w:pPr>
-        <w:ind w:left="-5"/>
-        <w:rPr>
-          <w:sz w:val="24"/>
-          <w:szCs w:val="24"/>
-        </w:rPr>
-      </w:pPr>
-    </w:p>
-    <w:p>
-      <w:pPr>
-        <w:ind w:left="-5"/>
-        <w:rPr>
-          <w:sz w:val="24"/>
-          <w:szCs w:val="24"/>
-        </w:rPr>
-      </w:pPr>
-    </w:p>
-    <w:p>
-      <w:pPr>
-        <w:ind w:left="-5"/>
-        <w:rPr>
-          <w:sz w:val="24"/>
-          <w:szCs w:val="24"/>
-        </w:rPr>
-      </w:pPr>
       <w:r>
         <w:rPr>
           <w:noProof/>
           <w:sz w:val="24"/>
           <w:szCs w:val="24"/>
         </w:rPr>
+        <w:lastRenderedPageBreak/>
         <w:drawing>
-          <wp:inline distT="0" distB="0" distL="0" distR="0" wp14:anchorId="6BA617D6" wp14:editId="5DED62FA">
+          <wp:inline distT="0" distB="0" distL="0" distR="0" wp14:anchorId="3B3F0ED5" wp14:editId="7D28CA0E">
             <wp:extent cx="5029200" cy="3352800"/>
             <wp:effectExtent l="0" t="0" r="0" b="0"/>
             <wp:docPr id="141" name="Picture 141"/>
@@ -952,6 +845,74 @@
     </w:p>
     <w:p>
       <w:pPr>
+        <w:spacing w:after="170"/>
+        <w:ind w:right="644"/>
+      </w:pPr>
+      <w:r>
+        <w:t>Figure 1: Females had a significantly higher survival rate than males</w:t>
+      </w:r>
+      <w:r>
+        <w:t>.</w:t>
+      </w:r>
+    </w:p>
+    <w:p>
+      <w:pPr>
+        <w:ind w:left="-5"/>
+        <w:rPr>
+          <w:sz w:val="24"/>
+          <w:szCs w:val="24"/>
+        </w:rPr>
+      </w:pPr>
+      <w:r>
+        <w:rPr>
+          <w:noProof/>
+        </w:rPr>
+        <w:drawing>
+          <wp:inline distT="0" distB="0" distL="0" distR="0" wp14:anchorId="28E4E78B" wp14:editId="70939343">
+            <wp:extent cx="5029200" cy="3352800"/>
+            <wp:effectExtent l="0" t="0" r="0" b="0"/>
+            <wp:docPr id="143" name="Picture 143"/>
+            <wp:cNvGraphicFramePr/>
+            <a:graphic xmlns:a="http://schemas.openxmlformats.org/drawingml/2006/main">
+              <a:graphicData uri="http://schemas.openxmlformats.org/drawingml/2006/picture">
+                <pic:pic xmlns:pic="http://schemas.openxmlformats.org/drawingml/2006/picture">
+                  <pic:nvPicPr>
+                    <pic:cNvPr id="143" name="Picture 143"/>
+                    <pic:cNvPicPr/>
+                  </pic:nvPicPr>
+                  <pic:blipFill>
+                    <a:blip r:embed="rId6"/>
+                    <a:stretch>
+                      <a:fillRect/>
+                    </a:stretch>
+                  </pic:blipFill>
+                  <pic:spPr>
+                    <a:xfrm>
+                      <a:off x="0" y="0"/>
+                      <a:ext cx="5029200" cy="3352800"/>
+                    </a:xfrm>
+                    <a:prstGeom prst="rect">
+                      <a:avLst/>
+                    </a:prstGeom>
+                  </pic:spPr>
+                </pic:pic>
+              </a:graphicData>
+            </a:graphic>
+          </wp:inline>
+        </w:drawing>
+      </w:r>
+    </w:p>
+    <w:p>
+      <w:pPr>
+        <w:ind w:left="-5"/>
+        <w:rPr>
+          <w:sz w:val="24"/>
+          <w:szCs w:val="24"/>
+        </w:rPr>
+      </w:pPr>
+    </w:p>
+    <w:p>
+      <w:pPr>
         <w:ind w:left="-5"/>
         <w:rPr>
           <w:sz w:val="24"/>
@@ -1004,7 +965,6 @@
           <w:b/>
           <w:bCs/>
         </w:rPr>
-        <w:lastRenderedPageBreak/>
         <w:t>5.0 DISCUSSION</w:t>
       </w:r>
     </w:p>
@@ -1175,7 +1135,7 @@
         </w:rPr>
         <w:t xml:space="preserve">Scikit-Learn Documentation: </w:t>
       </w:r>
-      <w:hyperlink r:id="rId6" w:history="1">
+      <w:hyperlink r:id="rId7" w:history="1">
         <w:r>
           <w:rPr>
             <w:rStyle w:val="Hyperlink"/>
@@ -1620,7 +1580,6 @@
           <w:sz w:val="24"/>
           <w:szCs w:val="24"/>
         </w:rPr>
-        <w:lastRenderedPageBreak/>
         <w:t># Load Data</w:t>
       </w:r>
     </w:p>
@@ -2359,41 +2318,6 @@
           <w:szCs w:val="24"/>
         </w:rPr>
       </w:pPr>
-      <w:r>
-        <w:rPr>
-          <w:sz w:val="24"/>
-          <w:szCs w:val="24"/>
-        </w:rPr>
-        <w:t>print(</w:t>
-      </w:r>
-      <w:proofErr w:type="spellStart"/>
-      <w:proofErr w:type="gramStart"/>
-      <w:r>
-        <w:rPr>
-          <w:sz w:val="24"/>
-          <w:szCs w:val="24"/>
-        </w:rPr>
-        <w:t>data.isnull</w:t>
-      </w:r>
-      <w:proofErr w:type="spellEnd"/>
-      <w:proofErr w:type="gramEnd"/>
-      <w:r>
-        <w:rPr>
-          <w:sz w:val="24"/>
-          <w:szCs w:val="24"/>
-        </w:rPr>
-        <w:t>().sum())</w:t>
-      </w:r>
-    </w:p>
-    <w:p>
-      <w:pPr>
-        <w:ind w:left="-5"/>
-        <w:rPr>
-          <w:sz w:val="24"/>
-          <w:szCs w:val="24"/>
-        </w:rPr>
-      </w:pPr>
-      <w:proofErr w:type="gramStart"/>
       <w:r>
         <w:rPr>
           <w:sz w:val="24"/>
@@ -2402,6 +2326,41 @@
         <w:lastRenderedPageBreak/>
         <w:t>print(</w:t>
       </w:r>
+      <w:proofErr w:type="spellStart"/>
+      <w:proofErr w:type="gramStart"/>
+      <w:r>
+        <w:rPr>
+          <w:sz w:val="24"/>
+          <w:szCs w:val="24"/>
+        </w:rPr>
+        <w:t>data.isnull</w:t>
+      </w:r>
+      <w:proofErr w:type="spellEnd"/>
+      <w:proofErr w:type="gramEnd"/>
+      <w:r>
+        <w:rPr>
+          <w:sz w:val="24"/>
+          <w:szCs w:val="24"/>
+        </w:rPr>
+        <w:t>().sum())</w:t>
+      </w:r>
+    </w:p>
+    <w:p>
+      <w:pPr>
+        <w:ind w:left="-5"/>
+        <w:rPr>
+          <w:sz w:val="24"/>
+          <w:szCs w:val="24"/>
+        </w:rPr>
+      </w:pPr>
+      <w:proofErr w:type="gramStart"/>
+      <w:r>
+        <w:rPr>
+          <w:sz w:val="24"/>
+          <w:szCs w:val="24"/>
+        </w:rPr>
+        <w:t>print(</w:t>
+      </w:r>
       <w:proofErr w:type="gramEnd"/>
       <w:r>
         <w:rPr>
@@ -3123,6 +3082,7 @@
           <w:sz w:val="24"/>
           <w:szCs w:val="24"/>
         </w:rPr>
+        <w:lastRenderedPageBreak/>
         <w:t>plt.title</w:t>
       </w:r>
       <w:proofErr w:type="spellEnd"/>
@@ -3150,59 +3110,1835 @@
           <w:sz w:val="24"/>
           <w:szCs w:val="24"/>
         </w:rPr>
+        <w:t>plt.xlabel</w:t>
+      </w:r>
+      <w:proofErr w:type="spellEnd"/>
+      <w:proofErr w:type="gramEnd"/>
+      <w:r>
+        <w:rPr>
+          <w:sz w:val="24"/>
+          <w:szCs w:val="24"/>
+        </w:rPr>
+        <w:t xml:space="preserve">("Passenger Class"); </w:t>
+      </w:r>
+      <w:proofErr w:type="spellStart"/>
+      <w:r>
+        <w:rPr>
+          <w:sz w:val="24"/>
+          <w:szCs w:val="24"/>
+        </w:rPr>
+        <w:t>plt.ylabel</w:t>
+      </w:r>
+      <w:proofErr w:type="spellEnd"/>
+      <w:r>
+        <w:rPr>
+          <w:sz w:val="24"/>
+          <w:szCs w:val="24"/>
+        </w:rPr>
+        <w:t>("Age")</w:t>
+      </w:r>
+    </w:p>
+    <w:p>
+      <w:pPr>
+        <w:ind w:left="-5"/>
+        <w:rPr>
+          <w:sz w:val="24"/>
+          <w:szCs w:val="24"/>
+        </w:rPr>
+      </w:pPr>
+      <w:proofErr w:type="spellStart"/>
+      <w:proofErr w:type="gramStart"/>
+      <w:r>
+        <w:rPr>
+          <w:sz w:val="24"/>
+          <w:szCs w:val="24"/>
+        </w:rPr>
+        <w:t>plt.tight</w:t>
+      </w:r>
+      <w:proofErr w:type="gramEnd"/>
+      <w:r>
+        <w:rPr>
+          <w:sz w:val="24"/>
+          <w:szCs w:val="24"/>
+        </w:rPr>
+        <w:t>_layout</w:t>
+      </w:r>
+      <w:proofErr w:type="spellEnd"/>
+      <w:r>
+        <w:rPr>
+          <w:sz w:val="24"/>
+          <w:szCs w:val="24"/>
+        </w:rPr>
+        <w:t>()</w:t>
+      </w:r>
+    </w:p>
+    <w:p>
+      <w:pPr>
+        <w:ind w:left="-5"/>
+        <w:rPr>
+          <w:sz w:val="24"/>
+          <w:szCs w:val="24"/>
+        </w:rPr>
+      </w:pPr>
+      <w:proofErr w:type="spellStart"/>
+      <w:proofErr w:type="gramStart"/>
+      <w:r>
+        <w:rPr>
+          <w:sz w:val="24"/>
+          <w:szCs w:val="24"/>
+        </w:rPr>
+        <w:t>plt.show</w:t>
+      </w:r>
+      <w:proofErr w:type="spellEnd"/>
+      <w:proofErr w:type="gramEnd"/>
+      <w:r>
+        <w:rPr>
+          <w:sz w:val="24"/>
+          <w:szCs w:val="24"/>
+        </w:rPr>
+        <w:t>()</w:t>
+      </w:r>
+    </w:p>
+    <w:p>
+      <w:pPr>
+        <w:ind w:left="-5"/>
+        <w:rPr>
+          <w:sz w:val="24"/>
+          <w:szCs w:val="24"/>
+        </w:rPr>
+      </w:pPr>
+      <w:proofErr w:type="gramStart"/>
+      <w:r>
+        <w:rPr>
+          <w:sz w:val="24"/>
+          <w:szCs w:val="24"/>
+        </w:rPr>
+        <w:t>print(</w:t>
+      </w:r>
+      <w:proofErr w:type="gramEnd"/>
+      <w:r>
+        <w:rPr>
+          <w:sz w:val="24"/>
+          <w:szCs w:val="24"/>
+        </w:rPr>
+        <w:t>" Interpretation: 1st Class passengers were generally older.")</w:t>
+      </w:r>
+    </w:p>
+    <w:p>
+      <w:pPr>
+        <w:ind w:left="-5"/>
+        <w:rPr>
+          <w:sz w:val="24"/>
+          <w:szCs w:val="24"/>
+        </w:rPr>
+      </w:pPr>
+    </w:p>
+    <w:p>
+      <w:pPr>
+        <w:ind w:left="-5"/>
+        <w:rPr>
+          <w:sz w:val="24"/>
+          <w:szCs w:val="24"/>
+        </w:rPr>
+      </w:pPr>
+      <w:r>
+        <w:rPr>
+          <w:sz w:val="24"/>
+          <w:szCs w:val="24"/>
+        </w:rPr>
+        <w:t># 4. Scatter</w:t>
+      </w:r>
+    </w:p>
+    <w:p>
+      <w:pPr>
+        <w:ind w:left="-5"/>
+        <w:rPr>
+          <w:sz w:val="24"/>
+          <w:szCs w:val="24"/>
+        </w:rPr>
+      </w:pPr>
+      <w:proofErr w:type="spellStart"/>
+      <w:proofErr w:type="gramStart"/>
+      <w:r>
+        <w:rPr>
+          <w:sz w:val="24"/>
+          <w:szCs w:val="24"/>
+        </w:rPr>
+        <w:t>plt.figure</w:t>
+      </w:r>
+      <w:proofErr w:type="spellEnd"/>
+      <w:proofErr w:type="gramEnd"/>
+      <w:r>
+        <w:rPr>
+          <w:sz w:val="24"/>
+          <w:szCs w:val="24"/>
+        </w:rPr>
+        <w:t>()</w:t>
+      </w:r>
+    </w:p>
+    <w:p>
+      <w:pPr>
+        <w:ind w:left="-5"/>
+        <w:rPr>
+          <w:sz w:val="24"/>
+          <w:szCs w:val="24"/>
+        </w:rPr>
+      </w:pPr>
+      <w:proofErr w:type="spellStart"/>
+      <w:proofErr w:type="gramStart"/>
+      <w:r>
+        <w:rPr>
+          <w:sz w:val="24"/>
+          <w:szCs w:val="24"/>
+        </w:rPr>
+        <w:t>sns.scatterplot</w:t>
+      </w:r>
+      <w:proofErr w:type="spellEnd"/>
+      <w:proofErr w:type="gramEnd"/>
+      <w:r>
+        <w:rPr>
+          <w:sz w:val="24"/>
+          <w:szCs w:val="24"/>
+        </w:rPr>
+        <w:t>(x='Age', y='Fare', hue='</w:t>
+      </w:r>
+      <w:proofErr w:type="spellStart"/>
+      <w:r>
+        <w:rPr>
+          <w:sz w:val="24"/>
+          <w:szCs w:val="24"/>
+        </w:rPr>
+        <w:t>Pclass</w:t>
+      </w:r>
+      <w:proofErr w:type="spellEnd"/>
+      <w:r>
+        <w:rPr>
+          <w:sz w:val="24"/>
+          <w:szCs w:val="24"/>
+        </w:rPr>
+        <w:t>', data=data, palette='</w:t>
+      </w:r>
+      <w:proofErr w:type="spellStart"/>
+      <w:r>
+        <w:rPr>
+          <w:sz w:val="24"/>
+          <w:szCs w:val="24"/>
+        </w:rPr>
+        <w:t>viridis</w:t>
+      </w:r>
+      <w:proofErr w:type="spellEnd"/>
+      <w:r>
+        <w:rPr>
+          <w:sz w:val="24"/>
+          <w:szCs w:val="24"/>
+        </w:rPr>
+        <w:t>', alpha=0.6)</w:t>
+      </w:r>
+    </w:p>
+    <w:p>
+      <w:pPr>
+        <w:ind w:left="-5"/>
+        <w:rPr>
+          <w:sz w:val="24"/>
+          <w:szCs w:val="24"/>
+        </w:rPr>
+      </w:pPr>
+      <w:proofErr w:type="spellStart"/>
+      <w:proofErr w:type="gramStart"/>
+      <w:r>
+        <w:rPr>
+          <w:sz w:val="24"/>
+          <w:szCs w:val="24"/>
+        </w:rPr>
+        <w:t>plt.title</w:t>
+      </w:r>
+      <w:proofErr w:type="spellEnd"/>
+      <w:proofErr w:type="gramEnd"/>
+      <w:r>
+        <w:rPr>
+          <w:sz w:val="24"/>
+          <w:szCs w:val="24"/>
+        </w:rPr>
+        <w:t>("Scatter Plot: Age vs Fare")</w:t>
+      </w:r>
+    </w:p>
+    <w:p>
+      <w:pPr>
+        <w:ind w:left="-5"/>
+        <w:rPr>
+          <w:sz w:val="24"/>
+          <w:szCs w:val="24"/>
+        </w:rPr>
+      </w:pPr>
+      <w:proofErr w:type="spellStart"/>
+      <w:proofErr w:type="gramStart"/>
+      <w:r>
+        <w:rPr>
+          <w:sz w:val="24"/>
+          <w:szCs w:val="24"/>
+        </w:rPr>
+        <w:t>plt.xlabel</w:t>
+      </w:r>
+      <w:proofErr w:type="spellEnd"/>
+      <w:proofErr w:type="gramEnd"/>
+      <w:r>
+        <w:rPr>
+          <w:sz w:val="24"/>
+          <w:szCs w:val="24"/>
+        </w:rPr>
+        <w:t xml:space="preserve">("Age"); </w:t>
+      </w:r>
+      <w:proofErr w:type="spellStart"/>
+      <w:r>
+        <w:rPr>
+          <w:sz w:val="24"/>
+          <w:szCs w:val="24"/>
+        </w:rPr>
+        <w:t>plt.ylabel</w:t>
+      </w:r>
+      <w:proofErr w:type="spellEnd"/>
+      <w:r>
+        <w:rPr>
+          <w:sz w:val="24"/>
+          <w:szCs w:val="24"/>
+        </w:rPr>
+        <w:t>("Fare")</w:t>
+      </w:r>
+    </w:p>
+    <w:p>
+      <w:pPr>
+        <w:ind w:left="-5"/>
+        <w:rPr>
+          <w:sz w:val="24"/>
+          <w:szCs w:val="24"/>
+        </w:rPr>
+      </w:pPr>
+      <w:proofErr w:type="spellStart"/>
+      <w:proofErr w:type="gramStart"/>
+      <w:r>
+        <w:rPr>
+          <w:sz w:val="24"/>
+          <w:szCs w:val="24"/>
+        </w:rPr>
+        <w:t>plt.tight</w:t>
+      </w:r>
+      <w:proofErr w:type="gramEnd"/>
+      <w:r>
+        <w:rPr>
+          <w:sz w:val="24"/>
+          <w:szCs w:val="24"/>
+        </w:rPr>
+        <w:t>_layout</w:t>
+      </w:r>
+      <w:proofErr w:type="spellEnd"/>
+      <w:r>
+        <w:rPr>
+          <w:sz w:val="24"/>
+          <w:szCs w:val="24"/>
+        </w:rPr>
+        <w:t>()</w:t>
+      </w:r>
+    </w:p>
+    <w:p>
+      <w:pPr>
+        <w:ind w:left="-5"/>
+        <w:rPr>
+          <w:sz w:val="24"/>
+          <w:szCs w:val="24"/>
+        </w:rPr>
+      </w:pPr>
+      <w:proofErr w:type="spellStart"/>
+      <w:proofErr w:type="gramStart"/>
+      <w:r>
+        <w:rPr>
+          <w:sz w:val="24"/>
+          <w:szCs w:val="24"/>
+        </w:rPr>
+        <w:t>plt.show</w:t>
+      </w:r>
+      <w:proofErr w:type="spellEnd"/>
+      <w:proofErr w:type="gramEnd"/>
+      <w:r>
+        <w:rPr>
+          <w:sz w:val="24"/>
+          <w:szCs w:val="24"/>
+        </w:rPr>
+        <w:t>()</w:t>
+      </w:r>
+    </w:p>
+    <w:p>
+      <w:pPr>
+        <w:ind w:left="-5"/>
+        <w:rPr>
+          <w:sz w:val="24"/>
+          <w:szCs w:val="24"/>
+        </w:rPr>
+      </w:pPr>
+      <w:proofErr w:type="gramStart"/>
+      <w:r>
+        <w:rPr>
+          <w:sz w:val="24"/>
+          <w:szCs w:val="24"/>
+        </w:rPr>
+        <w:t>print(</w:t>
+      </w:r>
+      <w:proofErr w:type="gramEnd"/>
+      <w:r>
+        <w:rPr>
+          <w:sz w:val="24"/>
+          <w:szCs w:val="24"/>
+        </w:rPr>
+        <w:t>" Interpretation: Higher fares were paid by 1st Class passengers.")</w:t>
+      </w:r>
+    </w:p>
+    <w:p>
+      <w:pPr>
+        <w:ind w:left="-5"/>
+        <w:rPr>
+          <w:sz w:val="24"/>
+          <w:szCs w:val="24"/>
+        </w:rPr>
+      </w:pPr>
+    </w:p>
+    <w:p>
+      <w:pPr>
+        <w:ind w:left="-5"/>
+        <w:rPr>
+          <w:sz w:val="24"/>
+          <w:szCs w:val="24"/>
+        </w:rPr>
+      </w:pPr>
+      <w:r>
+        <w:rPr>
+          <w:sz w:val="24"/>
+          <w:szCs w:val="24"/>
+        </w:rPr>
+        <w:t># 5. Heatmap</w:t>
+      </w:r>
+    </w:p>
+    <w:p>
+      <w:pPr>
+        <w:ind w:left="-5"/>
+        <w:rPr>
+          <w:sz w:val="24"/>
+          <w:szCs w:val="24"/>
+        </w:rPr>
+      </w:pPr>
+      <w:proofErr w:type="spellStart"/>
+      <w:r>
+        <w:rPr>
+          <w:sz w:val="24"/>
+          <w:szCs w:val="24"/>
+        </w:rPr>
+        <w:t>numeric_data</w:t>
+      </w:r>
+      <w:proofErr w:type="spellEnd"/>
+      <w:r>
+        <w:rPr>
+          <w:sz w:val="24"/>
+          <w:szCs w:val="24"/>
+        </w:rPr>
+        <w:t xml:space="preserve"> = </w:t>
+      </w:r>
+      <w:proofErr w:type="gramStart"/>
+      <w:r>
+        <w:rPr>
+          <w:sz w:val="24"/>
+          <w:szCs w:val="24"/>
+        </w:rPr>
+        <w:t>data[</w:t>
+      </w:r>
+      <w:proofErr w:type="gramEnd"/>
+      <w:r>
+        <w:rPr>
+          <w:sz w:val="24"/>
+          <w:szCs w:val="24"/>
+        </w:rPr>
+        <w:t>['Survived', '</w:t>
+      </w:r>
+      <w:proofErr w:type="spellStart"/>
+      <w:r>
+        <w:rPr>
+          <w:sz w:val="24"/>
+          <w:szCs w:val="24"/>
+        </w:rPr>
+        <w:t>Pclass</w:t>
+      </w:r>
+      <w:proofErr w:type="spellEnd"/>
+      <w:r>
+        <w:rPr>
+          <w:sz w:val="24"/>
+          <w:szCs w:val="24"/>
+        </w:rPr>
+        <w:t>', 'Age', '</w:t>
+      </w:r>
+      <w:proofErr w:type="spellStart"/>
+      <w:r>
+        <w:rPr>
+          <w:sz w:val="24"/>
+          <w:szCs w:val="24"/>
+        </w:rPr>
+        <w:t>SibSp</w:t>
+      </w:r>
+      <w:proofErr w:type="spellEnd"/>
+      <w:r>
+        <w:rPr>
+          <w:sz w:val="24"/>
+          <w:szCs w:val="24"/>
+        </w:rPr>
+        <w:t>', 'Parch', 'Fare']]</w:t>
+      </w:r>
+    </w:p>
+    <w:p>
+      <w:pPr>
+        <w:ind w:left="-5"/>
+        <w:rPr>
+          <w:sz w:val="24"/>
+          <w:szCs w:val="24"/>
+        </w:rPr>
+      </w:pPr>
+      <w:proofErr w:type="spellStart"/>
+      <w:proofErr w:type="gramStart"/>
+      <w:r>
+        <w:rPr>
+          <w:sz w:val="24"/>
+          <w:szCs w:val="24"/>
+        </w:rPr>
+        <w:t>plt.figure</w:t>
+      </w:r>
+      <w:proofErr w:type="spellEnd"/>
+      <w:proofErr w:type="gramEnd"/>
+      <w:r>
+        <w:rPr>
+          <w:sz w:val="24"/>
+          <w:szCs w:val="24"/>
+        </w:rPr>
+        <w:t>(</w:t>
+      </w:r>
+      <w:proofErr w:type="spellStart"/>
+      <w:r>
+        <w:rPr>
+          <w:sz w:val="24"/>
+          <w:szCs w:val="24"/>
+        </w:rPr>
+        <w:t>figsize</w:t>
+      </w:r>
+      <w:proofErr w:type="spellEnd"/>
+      <w:r>
+        <w:rPr>
+          <w:sz w:val="24"/>
+          <w:szCs w:val="24"/>
+        </w:rPr>
+        <w:t>=(7,5))</w:t>
+      </w:r>
+    </w:p>
+    <w:p>
+      <w:pPr>
+        <w:ind w:left="-5"/>
+        <w:rPr>
+          <w:sz w:val="24"/>
+          <w:szCs w:val="24"/>
+        </w:rPr>
+      </w:pPr>
+      <w:proofErr w:type="spellStart"/>
+      <w:proofErr w:type="gramStart"/>
+      <w:r>
+        <w:rPr>
+          <w:sz w:val="24"/>
+          <w:szCs w:val="24"/>
+        </w:rPr>
+        <w:t>sns.heatmap</w:t>
+      </w:r>
+      <w:proofErr w:type="spellEnd"/>
+      <w:proofErr w:type="gramEnd"/>
+      <w:r>
+        <w:rPr>
+          <w:sz w:val="24"/>
+          <w:szCs w:val="24"/>
+        </w:rPr>
+        <w:t>(</w:t>
+      </w:r>
+      <w:proofErr w:type="spellStart"/>
+      <w:r>
+        <w:rPr>
+          <w:sz w:val="24"/>
+          <w:szCs w:val="24"/>
+        </w:rPr>
+        <w:t>numeric_data.corr</w:t>
+      </w:r>
+      <w:proofErr w:type="spellEnd"/>
+      <w:r>
+        <w:rPr>
+          <w:sz w:val="24"/>
+          <w:szCs w:val="24"/>
+        </w:rPr>
+        <w:t xml:space="preserve">(), </w:t>
+      </w:r>
+      <w:proofErr w:type="spellStart"/>
+      <w:r>
+        <w:rPr>
+          <w:sz w:val="24"/>
+          <w:szCs w:val="24"/>
+        </w:rPr>
+        <w:t>annot</w:t>
+      </w:r>
+      <w:proofErr w:type="spellEnd"/>
+      <w:r>
+        <w:rPr>
+          <w:sz w:val="24"/>
+          <w:szCs w:val="24"/>
+        </w:rPr>
+        <w:t xml:space="preserve">=True, </w:t>
+      </w:r>
+      <w:proofErr w:type="spellStart"/>
+      <w:r>
+        <w:rPr>
+          <w:sz w:val="24"/>
+          <w:szCs w:val="24"/>
+        </w:rPr>
+        <w:t>cmap</w:t>
+      </w:r>
+      <w:proofErr w:type="spellEnd"/>
+      <w:r>
+        <w:rPr>
+          <w:sz w:val="24"/>
+          <w:szCs w:val="24"/>
+        </w:rPr>
+        <w:t>='</w:t>
+      </w:r>
+      <w:proofErr w:type="spellStart"/>
+      <w:r>
+        <w:rPr>
+          <w:sz w:val="24"/>
+          <w:szCs w:val="24"/>
+        </w:rPr>
+        <w:t>coolwarm</w:t>
+      </w:r>
+      <w:proofErr w:type="spellEnd"/>
+      <w:r>
+        <w:rPr>
+          <w:sz w:val="24"/>
+          <w:szCs w:val="24"/>
+        </w:rPr>
+        <w:t xml:space="preserve">', </w:t>
+      </w:r>
+      <w:proofErr w:type="spellStart"/>
+      <w:r>
+        <w:rPr>
+          <w:sz w:val="24"/>
+          <w:szCs w:val="24"/>
+        </w:rPr>
+        <w:t>fmt</w:t>
+      </w:r>
+      <w:proofErr w:type="spellEnd"/>
+      <w:r>
+        <w:rPr>
+          <w:sz w:val="24"/>
+          <w:szCs w:val="24"/>
+        </w:rPr>
+        <w:t>=".2f")</w:t>
+      </w:r>
+    </w:p>
+    <w:p>
+      <w:pPr>
+        <w:ind w:left="-5"/>
+        <w:rPr>
+          <w:sz w:val="24"/>
+          <w:szCs w:val="24"/>
+        </w:rPr>
+      </w:pPr>
+      <w:proofErr w:type="spellStart"/>
+      <w:proofErr w:type="gramStart"/>
+      <w:r>
+        <w:rPr>
+          <w:sz w:val="24"/>
+          <w:szCs w:val="24"/>
+        </w:rPr>
+        <w:t>plt.title</w:t>
+      </w:r>
+      <w:proofErr w:type="spellEnd"/>
+      <w:proofErr w:type="gramEnd"/>
+      <w:r>
+        <w:rPr>
+          <w:sz w:val="24"/>
+          <w:szCs w:val="24"/>
+        </w:rPr>
+        <w:t>("Correlation Heatmap")</w:t>
+      </w:r>
+    </w:p>
+    <w:p>
+      <w:pPr>
+        <w:ind w:left="-5"/>
+        <w:rPr>
+          <w:sz w:val="24"/>
+          <w:szCs w:val="24"/>
+        </w:rPr>
+      </w:pPr>
+      <w:proofErr w:type="spellStart"/>
+      <w:proofErr w:type="gramStart"/>
+      <w:r>
+        <w:rPr>
+          <w:sz w:val="24"/>
+          <w:szCs w:val="24"/>
+        </w:rPr>
+        <w:t>plt.tight</w:t>
+      </w:r>
+      <w:proofErr w:type="gramEnd"/>
+      <w:r>
+        <w:rPr>
+          <w:sz w:val="24"/>
+          <w:szCs w:val="24"/>
+        </w:rPr>
+        <w:t>_layout</w:t>
+      </w:r>
+      <w:proofErr w:type="spellEnd"/>
+      <w:r>
+        <w:rPr>
+          <w:sz w:val="24"/>
+          <w:szCs w:val="24"/>
+        </w:rPr>
+        <w:t>()</w:t>
+      </w:r>
+    </w:p>
+    <w:p>
+      <w:pPr>
+        <w:ind w:left="-5"/>
+        <w:rPr>
+          <w:sz w:val="24"/>
+          <w:szCs w:val="24"/>
+        </w:rPr>
+      </w:pPr>
+      <w:proofErr w:type="spellStart"/>
+      <w:proofErr w:type="gramStart"/>
+      <w:r>
+        <w:rPr>
+          <w:sz w:val="24"/>
+          <w:szCs w:val="24"/>
+        </w:rPr>
+        <w:t>plt.show</w:t>
+      </w:r>
+      <w:proofErr w:type="spellEnd"/>
+      <w:proofErr w:type="gramEnd"/>
+      <w:r>
+        <w:rPr>
+          <w:sz w:val="24"/>
+          <w:szCs w:val="24"/>
+        </w:rPr>
+        <w:t>()</w:t>
+      </w:r>
+    </w:p>
+    <w:p>
+      <w:pPr>
+        <w:ind w:left="-5"/>
+        <w:rPr>
+          <w:sz w:val="24"/>
+          <w:szCs w:val="24"/>
+        </w:rPr>
+      </w:pPr>
+    </w:p>
+    <w:p>
+      <w:pPr>
+        <w:ind w:left="-5"/>
+        <w:rPr>
+          <w:sz w:val="24"/>
+          <w:szCs w:val="24"/>
+        </w:rPr>
+      </w:pPr>
+      <w:r>
+        <w:rPr>
+          <w:sz w:val="24"/>
+          <w:szCs w:val="24"/>
+        </w:rPr>
+        <w:t xml:space="preserve"># 6. </w:t>
+      </w:r>
+      <w:proofErr w:type="spellStart"/>
+      <w:r>
+        <w:rPr>
+          <w:sz w:val="24"/>
+          <w:szCs w:val="24"/>
+        </w:rPr>
+        <w:t>Pairplot</w:t>
+      </w:r>
+      <w:proofErr w:type="spellEnd"/>
+    </w:p>
+    <w:p>
+      <w:pPr>
+        <w:ind w:left="-5"/>
+        <w:rPr>
+          <w:sz w:val="24"/>
+          <w:szCs w:val="24"/>
+        </w:rPr>
+      </w:pPr>
+      <w:proofErr w:type="spellStart"/>
+      <w:proofErr w:type="gramStart"/>
+      <w:r>
+        <w:rPr>
+          <w:sz w:val="24"/>
+          <w:szCs w:val="24"/>
+        </w:rPr>
+        <w:t>sns.pairplot</w:t>
+      </w:r>
+      <w:proofErr w:type="spellEnd"/>
+      <w:proofErr w:type="gramEnd"/>
+      <w:r>
+        <w:rPr>
+          <w:sz w:val="24"/>
+          <w:szCs w:val="24"/>
+        </w:rPr>
+        <w:t>(</w:t>
+      </w:r>
+      <w:proofErr w:type="spellStart"/>
+      <w:r>
+        <w:rPr>
+          <w:sz w:val="24"/>
+          <w:szCs w:val="24"/>
+        </w:rPr>
+        <w:t>numeric_data</w:t>
+      </w:r>
+      <w:proofErr w:type="spellEnd"/>
+      <w:r>
+        <w:rPr>
+          <w:sz w:val="24"/>
+          <w:szCs w:val="24"/>
+        </w:rPr>
+        <w:t>)</w:t>
+      </w:r>
+    </w:p>
+    <w:p>
+      <w:pPr>
+        <w:ind w:left="-5"/>
+        <w:rPr>
+          <w:sz w:val="24"/>
+          <w:szCs w:val="24"/>
+        </w:rPr>
+      </w:pPr>
+      <w:proofErr w:type="spellStart"/>
+      <w:proofErr w:type="gramStart"/>
+      <w:r>
+        <w:rPr>
+          <w:sz w:val="24"/>
+          <w:szCs w:val="24"/>
+        </w:rPr>
+        <w:t>plt.suptitle</w:t>
+      </w:r>
+      <w:proofErr w:type="spellEnd"/>
+      <w:proofErr w:type="gramEnd"/>
+      <w:r>
+        <w:rPr>
+          <w:sz w:val="24"/>
+          <w:szCs w:val="24"/>
+        </w:rPr>
+        <w:t>("</w:t>
+      </w:r>
+      <w:proofErr w:type="spellStart"/>
+      <w:r>
+        <w:rPr>
+          <w:sz w:val="24"/>
+          <w:szCs w:val="24"/>
+        </w:rPr>
+        <w:t>Pairplot</w:t>
+      </w:r>
+      <w:proofErr w:type="spellEnd"/>
+      <w:r>
+        <w:rPr>
+          <w:sz w:val="24"/>
+          <w:szCs w:val="24"/>
+        </w:rPr>
+        <w:t xml:space="preserve"> of Numerical Variables", y=1.02)</w:t>
+      </w:r>
+    </w:p>
+    <w:p>
+      <w:pPr>
+        <w:ind w:left="-5"/>
+        <w:rPr>
+          <w:sz w:val="24"/>
+          <w:szCs w:val="24"/>
+        </w:rPr>
+      </w:pPr>
+      <w:proofErr w:type="spellStart"/>
+      <w:proofErr w:type="gramStart"/>
+      <w:r>
+        <w:rPr>
+          <w:sz w:val="24"/>
+          <w:szCs w:val="24"/>
+        </w:rPr>
+        <w:t>plt.show</w:t>
+      </w:r>
+      <w:proofErr w:type="spellEnd"/>
+      <w:proofErr w:type="gramEnd"/>
+      <w:r>
+        <w:rPr>
+          <w:sz w:val="24"/>
+          <w:szCs w:val="24"/>
+        </w:rPr>
+        <w:t>()</w:t>
+      </w:r>
+    </w:p>
+    <w:p>
+      <w:pPr>
+        <w:ind w:left="-5"/>
+        <w:rPr>
+          <w:sz w:val="24"/>
+          <w:szCs w:val="24"/>
+        </w:rPr>
+      </w:pPr>
+    </w:p>
+    <w:p>
+      <w:pPr>
+        <w:ind w:left="-5"/>
+        <w:rPr>
+          <w:sz w:val="24"/>
+          <w:szCs w:val="24"/>
+        </w:rPr>
+      </w:pPr>
+    </w:p>
+    <w:p>
+      <w:pPr>
+        <w:ind w:left="-5"/>
+        <w:rPr>
+          <w:sz w:val="24"/>
+          <w:szCs w:val="24"/>
+        </w:rPr>
+      </w:pPr>
+      <w:r>
+        <w:rPr>
+          <w:sz w:val="24"/>
+          <w:szCs w:val="24"/>
+        </w:rPr>
+        <w:t># TASK 4: STATISTICAL ANALYSIS</w:t>
+      </w:r>
+    </w:p>
+    <w:p>
+      <w:pPr>
+        <w:ind w:left="-5"/>
+        <w:rPr>
+          <w:sz w:val="24"/>
+          <w:szCs w:val="24"/>
+        </w:rPr>
+      </w:pPr>
+      <w:proofErr w:type="gramStart"/>
+      <w:r>
+        <w:rPr>
+          <w:sz w:val="24"/>
+          <w:szCs w:val="24"/>
+        </w:rPr>
+        <w:t>print(</w:t>
+      </w:r>
+      <w:proofErr w:type="gramEnd"/>
+      <w:r>
+        <w:rPr>
+          <w:sz w:val="24"/>
+          <w:szCs w:val="24"/>
+        </w:rPr>
+        <w:t>"TASK 4: STATISTICAL ANALYSIS")</w:t>
+      </w:r>
+    </w:p>
+    <w:p>
+      <w:pPr>
+        <w:ind w:left="-5"/>
+        <w:rPr>
+          <w:sz w:val="24"/>
+          <w:szCs w:val="24"/>
+        </w:rPr>
+      </w:pPr>
+      <w:proofErr w:type="gramStart"/>
+      <w:r>
+        <w:rPr>
+          <w:sz w:val="24"/>
+          <w:szCs w:val="24"/>
+        </w:rPr>
+        <w:t>print(</w:t>
+      </w:r>
+      <w:proofErr w:type="gramEnd"/>
+      <w:r>
+        <w:rPr>
+          <w:sz w:val="24"/>
+          <w:szCs w:val="24"/>
+        </w:rPr>
+        <w:t>"\n1. Descriptive Statistics:")</w:t>
+      </w:r>
+    </w:p>
+    <w:p>
+      <w:pPr>
+        <w:ind w:left="-5"/>
+        <w:rPr>
+          <w:sz w:val="24"/>
+          <w:szCs w:val="24"/>
+        </w:rPr>
+      </w:pPr>
+      <w:r>
+        <w:rPr>
+          <w:sz w:val="24"/>
+          <w:szCs w:val="24"/>
+        </w:rPr>
+        <w:t>print(</w:t>
+      </w:r>
+      <w:proofErr w:type="spellStart"/>
+      <w:r>
+        <w:rPr>
+          <w:sz w:val="24"/>
+          <w:szCs w:val="24"/>
+        </w:rPr>
+        <w:t>numeric_</w:t>
+      </w:r>
+      <w:proofErr w:type="gramStart"/>
+      <w:r>
+        <w:rPr>
+          <w:sz w:val="24"/>
+          <w:szCs w:val="24"/>
+        </w:rPr>
+        <w:t>data.describe</w:t>
+      </w:r>
+      <w:proofErr w:type="spellEnd"/>
+      <w:proofErr w:type="gramEnd"/>
+      <w:r>
+        <w:rPr>
+          <w:sz w:val="24"/>
+          <w:szCs w:val="24"/>
+        </w:rPr>
+        <w:t>().round(2))</w:t>
+      </w:r>
+    </w:p>
+    <w:p>
+      <w:pPr>
+        <w:ind w:left="-5"/>
+        <w:rPr>
+          <w:sz w:val="24"/>
+          <w:szCs w:val="24"/>
+        </w:rPr>
+      </w:pPr>
+      <w:proofErr w:type="gramStart"/>
+      <w:r>
+        <w:rPr>
+          <w:sz w:val="24"/>
+          <w:szCs w:val="24"/>
+        </w:rPr>
+        <w:t>print(</w:t>
+      </w:r>
+      <w:proofErr w:type="gramEnd"/>
+      <w:r>
+        <w:rPr>
+          <w:sz w:val="24"/>
+          <w:szCs w:val="24"/>
+        </w:rPr>
+        <w:t>"\n2. Frequency Distribution:")</w:t>
+      </w:r>
+    </w:p>
+    <w:p>
+      <w:pPr>
+        <w:ind w:left="-5"/>
+        <w:rPr>
+          <w:sz w:val="24"/>
+          <w:szCs w:val="24"/>
+        </w:rPr>
+      </w:pPr>
+      <w:proofErr w:type="gramStart"/>
+      <w:r>
+        <w:rPr>
+          <w:sz w:val="24"/>
+          <w:szCs w:val="24"/>
+        </w:rPr>
+        <w:t>print(</w:t>
+      </w:r>
+      <w:proofErr w:type="gramEnd"/>
+      <w:r>
+        <w:rPr>
+          <w:sz w:val="24"/>
+          <w:szCs w:val="24"/>
+        </w:rPr>
+        <w:t>"Survival:\n", data['Survived'].</w:t>
+      </w:r>
+      <w:proofErr w:type="spellStart"/>
+      <w:r>
+        <w:rPr>
+          <w:sz w:val="24"/>
+          <w:szCs w:val="24"/>
+        </w:rPr>
+        <w:t>value_counts</w:t>
+      </w:r>
+      <w:proofErr w:type="spellEnd"/>
+      <w:r>
+        <w:rPr>
+          <w:sz w:val="24"/>
+          <w:szCs w:val="24"/>
+        </w:rPr>
+        <w:t>())</w:t>
+      </w:r>
+    </w:p>
+    <w:p>
+      <w:pPr>
+        <w:ind w:left="-5"/>
+        <w:rPr>
+          <w:sz w:val="24"/>
+          <w:szCs w:val="24"/>
+        </w:rPr>
+      </w:pPr>
+      <w:proofErr w:type="gramStart"/>
+      <w:r>
+        <w:rPr>
+          <w:sz w:val="24"/>
+          <w:szCs w:val="24"/>
+        </w:rPr>
+        <w:t>print(</w:t>
+      </w:r>
+      <w:proofErr w:type="gramEnd"/>
+      <w:r>
+        <w:rPr>
+          <w:sz w:val="24"/>
+          <w:szCs w:val="24"/>
+        </w:rPr>
+        <w:t>"\</w:t>
+      </w:r>
+      <w:proofErr w:type="spellStart"/>
+      <w:r>
+        <w:rPr>
+          <w:sz w:val="24"/>
+          <w:szCs w:val="24"/>
+        </w:rPr>
+        <w:t>nPclass</w:t>
+      </w:r>
+      <w:proofErr w:type="spellEnd"/>
+      <w:r>
+        <w:rPr>
+          <w:sz w:val="24"/>
+          <w:szCs w:val="24"/>
+        </w:rPr>
+        <w:t>:\n", data['</w:t>
+      </w:r>
+      <w:proofErr w:type="spellStart"/>
+      <w:r>
+        <w:rPr>
+          <w:sz w:val="24"/>
+          <w:szCs w:val="24"/>
+        </w:rPr>
+        <w:t>Pclass</w:t>
+      </w:r>
+      <w:proofErr w:type="spellEnd"/>
+      <w:r>
+        <w:rPr>
+          <w:sz w:val="24"/>
+          <w:szCs w:val="24"/>
+        </w:rPr>
+        <w:t>'].</w:t>
+      </w:r>
+      <w:proofErr w:type="spellStart"/>
+      <w:r>
+        <w:rPr>
+          <w:sz w:val="24"/>
+          <w:szCs w:val="24"/>
+        </w:rPr>
+        <w:t>value_counts</w:t>
+      </w:r>
+      <w:proofErr w:type="spellEnd"/>
+      <w:r>
+        <w:rPr>
+          <w:sz w:val="24"/>
+          <w:szCs w:val="24"/>
+        </w:rPr>
+        <w:t>().</w:t>
+      </w:r>
+      <w:proofErr w:type="spellStart"/>
+      <w:r>
+        <w:rPr>
+          <w:sz w:val="24"/>
+          <w:szCs w:val="24"/>
+        </w:rPr>
+        <w:t>sort_index</w:t>
+      </w:r>
+      <w:proofErr w:type="spellEnd"/>
+      <w:r>
+        <w:rPr>
+          <w:sz w:val="24"/>
+          <w:szCs w:val="24"/>
+        </w:rPr>
+        <w:t>())</w:t>
+      </w:r>
+    </w:p>
+    <w:p>
+      <w:pPr>
+        <w:ind w:left="-5"/>
+        <w:rPr>
+          <w:sz w:val="24"/>
+          <w:szCs w:val="24"/>
+        </w:rPr>
+      </w:pPr>
+      <w:proofErr w:type="gramStart"/>
+      <w:r>
+        <w:rPr>
+          <w:sz w:val="24"/>
+          <w:szCs w:val="24"/>
+        </w:rPr>
+        <w:t>print(</w:t>
+      </w:r>
+      <w:proofErr w:type="gramEnd"/>
+      <w:r>
+        <w:rPr>
+          <w:sz w:val="24"/>
+          <w:szCs w:val="24"/>
+        </w:rPr>
+        <w:t>"\</w:t>
+      </w:r>
+      <w:proofErr w:type="spellStart"/>
+      <w:r>
+        <w:rPr>
+          <w:sz w:val="24"/>
+          <w:szCs w:val="24"/>
+        </w:rPr>
+        <w:t>nSex</w:t>
+      </w:r>
+      <w:proofErr w:type="spellEnd"/>
+      <w:r>
+        <w:rPr>
+          <w:sz w:val="24"/>
+          <w:szCs w:val="24"/>
+        </w:rPr>
+        <w:t>:\n", data['Sex'].</w:t>
+      </w:r>
+      <w:proofErr w:type="spellStart"/>
+      <w:r>
+        <w:rPr>
+          <w:sz w:val="24"/>
+          <w:szCs w:val="24"/>
+        </w:rPr>
+        <w:t>value_counts</w:t>
+      </w:r>
+      <w:proofErr w:type="spellEnd"/>
+      <w:r>
+        <w:rPr>
+          <w:sz w:val="24"/>
+          <w:szCs w:val="24"/>
+        </w:rPr>
+        <w:t>())</w:t>
+      </w:r>
+    </w:p>
+    <w:p>
+      <w:pPr>
+        <w:ind w:left="-5"/>
+        <w:rPr>
+          <w:sz w:val="24"/>
+          <w:szCs w:val="24"/>
+        </w:rPr>
+      </w:pPr>
+      <w:proofErr w:type="gramStart"/>
+      <w:r>
+        <w:rPr>
+          <w:sz w:val="24"/>
+          <w:szCs w:val="24"/>
+        </w:rPr>
+        <w:t>print(</w:t>
+      </w:r>
+      <w:proofErr w:type="gramEnd"/>
+      <w:r>
+        <w:rPr>
+          <w:sz w:val="24"/>
+          <w:szCs w:val="24"/>
+        </w:rPr>
+        <w:t>"\n3. Correlation Matrix:")</w:t>
+      </w:r>
+    </w:p>
+    <w:p>
+      <w:pPr>
+        <w:ind w:left="-5"/>
+        <w:rPr>
+          <w:sz w:val="24"/>
+          <w:szCs w:val="24"/>
+        </w:rPr>
+      </w:pPr>
+      <w:r>
+        <w:rPr>
+          <w:sz w:val="24"/>
+          <w:szCs w:val="24"/>
+        </w:rPr>
+        <w:t>print(</w:t>
+      </w:r>
+      <w:proofErr w:type="spellStart"/>
+      <w:r>
+        <w:rPr>
+          <w:sz w:val="24"/>
+          <w:szCs w:val="24"/>
+        </w:rPr>
+        <w:t>numeric_</w:t>
+      </w:r>
+      <w:proofErr w:type="gramStart"/>
+      <w:r>
+        <w:rPr>
+          <w:sz w:val="24"/>
+          <w:szCs w:val="24"/>
+        </w:rPr>
+        <w:t>data.corr</w:t>
+      </w:r>
+      <w:proofErr w:type="spellEnd"/>
+      <w:proofErr w:type="gramEnd"/>
+      <w:r>
+        <w:rPr>
+          <w:sz w:val="24"/>
+          <w:szCs w:val="24"/>
+        </w:rPr>
+        <w:t>().round(2))</w:t>
+      </w:r>
+    </w:p>
+    <w:p>
+      <w:pPr>
+        <w:ind w:left="-5"/>
+        <w:rPr>
+          <w:sz w:val="24"/>
+          <w:szCs w:val="24"/>
+        </w:rPr>
+      </w:pPr>
+      <w:proofErr w:type="spellStart"/>
+      <w:r>
+        <w:rPr>
+          <w:sz w:val="24"/>
+          <w:szCs w:val="24"/>
+        </w:rPr>
+        <w:t>corr</w:t>
+      </w:r>
+      <w:proofErr w:type="spellEnd"/>
+      <w:r>
+        <w:rPr>
+          <w:sz w:val="24"/>
+          <w:szCs w:val="24"/>
+        </w:rPr>
+        <w:t xml:space="preserve"> = </w:t>
+      </w:r>
+      <w:proofErr w:type="spellStart"/>
+      <w:r>
+        <w:rPr>
+          <w:sz w:val="24"/>
+          <w:szCs w:val="24"/>
+        </w:rPr>
+        <w:t>numeric_</w:t>
+      </w:r>
+      <w:proofErr w:type="gramStart"/>
+      <w:r>
+        <w:rPr>
+          <w:sz w:val="24"/>
+          <w:szCs w:val="24"/>
+        </w:rPr>
+        <w:t>data.corr</w:t>
+      </w:r>
+      <w:proofErr w:type="spellEnd"/>
+      <w:proofErr w:type="gramEnd"/>
+      <w:r>
+        <w:rPr>
+          <w:sz w:val="24"/>
+          <w:szCs w:val="24"/>
+        </w:rPr>
+        <w:t>()</w:t>
+      </w:r>
+    </w:p>
+    <w:p>
+      <w:pPr>
+        <w:ind w:left="-5"/>
+        <w:rPr>
+          <w:sz w:val="24"/>
+          <w:szCs w:val="24"/>
+        </w:rPr>
+      </w:pPr>
+      <w:proofErr w:type="gramStart"/>
+      <w:r>
+        <w:rPr>
+          <w:sz w:val="24"/>
+          <w:szCs w:val="24"/>
+        </w:rPr>
+        <w:t>print(</w:t>
+      </w:r>
+      <w:proofErr w:type="gramEnd"/>
+      <w:r>
+        <w:rPr>
+          <w:sz w:val="24"/>
+          <w:szCs w:val="24"/>
+        </w:rPr>
+        <w:t xml:space="preserve">"\n4. Strongest Positive Correlation:", </w:t>
+      </w:r>
+      <w:proofErr w:type="spellStart"/>
+      <w:r>
+        <w:rPr>
+          <w:sz w:val="24"/>
+          <w:szCs w:val="24"/>
+        </w:rPr>
+        <w:t>corr.abs</w:t>
+      </w:r>
+      <w:proofErr w:type="spellEnd"/>
+      <w:r>
+        <w:rPr>
+          <w:sz w:val="24"/>
+          <w:szCs w:val="24"/>
+        </w:rPr>
+        <w:t>(</w:t>
+      </w:r>
+      <w:proofErr w:type="gramStart"/>
+      <w:r>
+        <w:rPr>
+          <w:sz w:val="24"/>
+          <w:szCs w:val="24"/>
+        </w:rPr>
+        <w:t>).unstack</w:t>
+      </w:r>
+      <w:proofErr w:type="gramEnd"/>
+      <w:r>
+        <w:rPr>
+          <w:sz w:val="24"/>
+          <w:szCs w:val="24"/>
+        </w:rPr>
+        <w:t>().</w:t>
+      </w:r>
+      <w:proofErr w:type="spellStart"/>
+      <w:r>
+        <w:rPr>
+          <w:sz w:val="24"/>
+          <w:szCs w:val="24"/>
+        </w:rPr>
+        <w:t>sort_values</w:t>
+      </w:r>
+      <w:proofErr w:type="spellEnd"/>
+      <w:r>
+        <w:rPr>
+          <w:sz w:val="24"/>
+          <w:szCs w:val="24"/>
+        </w:rPr>
+        <w:t>(ascending=False)[1:2])</w:t>
+      </w:r>
+    </w:p>
+    <w:p>
+      <w:pPr>
+        <w:ind w:left="-5"/>
+        <w:rPr>
+          <w:sz w:val="24"/>
+          <w:szCs w:val="24"/>
+        </w:rPr>
+      </w:pPr>
+      <w:proofErr w:type="gramStart"/>
+      <w:r>
+        <w:rPr>
+          <w:sz w:val="24"/>
+          <w:szCs w:val="24"/>
+        </w:rPr>
+        <w:t>print(</w:t>
+      </w:r>
+      <w:proofErr w:type="gramEnd"/>
+      <w:r>
+        <w:rPr>
+          <w:sz w:val="24"/>
+          <w:szCs w:val="24"/>
+        </w:rPr>
+        <w:t xml:space="preserve">"\n5. Strongest Negative Correlation:", </w:t>
+      </w:r>
+      <w:proofErr w:type="spellStart"/>
+      <w:proofErr w:type="gramStart"/>
+      <w:r>
+        <w:rPr>
+          <w:sz w:val="24"/>
+          <w:szCs w:val="24"/>
+        </w:rPr>
+        <w:t>corr.unstack</w:t>
+      </w:r>
+      <w:proofErr w:type="spellEnd"/>
+      <w:proofErr w:type="gramEnd"/>
+      <w:r>
+        <w:rPr>
+          <w:sz w:val="24"/>
+          <w:szCs w:val="24"/>
+        </w:rPr>
+        <w:t>().</w:t>
+      </w:r>
+      <w:proofErr w:type="spellStart"/>
+      <w:r>
+        <w:rPr>
+          <w:sz w:val="24"/>
+          <w:szCs w:val="24"/>
+        </w:rPr>
+        <w:t>sort_values</w:t>
+      </w:r>
+      <w:proofErr w:type="spellEnd"/>
+      <w:r>
+        <w:rPr>
+          <w:sz w:val="24"/>
+          <w:szCs w:val="24"/>
+        </w:rPr>
+        <w:t>().head(1))</w:t>
+      </w:r>
+    </w:p>
+    <w:p>
+      <w:pPr>
+        <w:ind w:left="-5"/>
+        <w:rPr>
+          <w:sz w:val="24"/>
+          <w:szCs w:val="24"/>
+        </w:rPr>
+      </w:pPr>
+      <w:proofErr w:type="gramStart"/>
+      <w:r>
+        <w:rPr>
+          <w:sz w:val="24"/>
+          <w:szCs w:val="24"/>
+        </w:rPr>
+        <w:t>print(</w:t>
+      </w:r>
+      <w:proofErr w:type="gramEnd"/>
+      <w:r>
+        <w:rPr>
+          <w:sz w:val="24"/>
+          <w:szCs w:val="24"/>
+        </w:rPr>
+        <w:t>"\n6. Key Findings:")</w:t>
+      </w:r>
+    </w:p>
+    <w:p>
+      <w:pPr>
+        <w:ind w:left="-5"/>
+        <w:rPr>
+          <w:sz w:val="24"/>
+          <w:szCs w:val="24"/>
+        </w:rPr>
+      </w:pPr>
+      <w:proofErr w:type="gramStart"/>
+      <w:r>
+        <w:rPr>
+          <w:sz w:val="24"/>
+          <w:szCs w:val="24"/>
+        </w:rPr>
+        <w:t>print(</w:t>
+      </w:r>
+      <w:proofErr w:type="gramEnd"/>
+      <w:r>
+        <w:rPr>
+          <w:sz w:val="24"/>
+          <w:szCs w:val="24"/>
+        </w:rPr>
+        <w:t xml:space="preserve">"1. Strong correlation between </w:t>
+      </w:r>
+      <w:proofErr w:type="spellStart"/>
+      <w:r>
+        <w:rPr>
+          <w:sz w:val="24"/>
+          <w:szCs w:val="24"/>
+        </w:rPr>
+        <w:t>Pclass</w:t>
+      </w:r>
+      <w:proofErr w:type="spellEnd"/>
+      <w:r>
+        <w:rPr>
+          <w:sz w:val="24"/>
+          <w:szCs w:val="24"/>
+        </w:rPr>
+        <w:t xml:space="preserve"> and Fare.")</w:t>
+      </w:r>
+    </w:p>
+    <w:p>
+      <w:pPr>
+        <w:ind w:left="-5"/>
+        <w:rPr>
+          <w:sz w:val="24"/>
+          <w:szCs w:val="24"/>
+        </w:rPr>
+      </w:pPr>
+      <w:proofErr w:type="gramStart"/>
+      <w:r>
+        <w:rPr>
+          <w:sz w:val="24"/>
+          <w:szCs w:val="24"/>
+        </w:rPr>
+        <w:t>print(</w:t>
+      </w:r>
+      <w:proofErr w:type="gramEnd"/>
+      <w:r>
+        <w:rPr>
+          <w:sz w:val="24"/>
+          <w:szCs w:val="24"/>
+        </w:rPr>
+        <w:t>"2. Females and 1st Class had higher survival rates.")</w:t>
+      </w:r>
+    </w:p>
+    <w:p>
+      <w:pPr>
+        <w:ind w:left="-5"/>
+        <w:rPr>
+          <w:sz w:val="24"/>
+          <w:szCs w:val="24"/>
+        </w:rPr>
+      </w:pPr>
+      <w:proofErr w:type="gramStart"/>
+      <w:r>
+        <w:rPr>
+          <w:sz w:val="24"/>
+          <w:szCs w:val="24"/>
+        </w:rPr>
+        <w:t>print(</w:t>
+      </w:r>
+      <w:proofErr w:type="gramEnd"/>
+      <w:r>
+        <w:rPr>
+          <w:sz w:val="24"/>
+          <w:szCs w:val="24"/>
+        </w:rPr>
+        <w:t>"3. Most passengers were young adults.")</w:t>
+      </w:r>
+    </w:p>
+    <w:p>
+      <w:pPr>
+        <w:ind w:left="-5"/>
+        <w:rPr>
+          <w:sz w:val="24"/>
+          <w:szCs w:val="24"/>
+        </w:rPr>
+      </w:pPr>
+    </w:p>
+    <w:p>
+      <w:pPr>
+        <w:ind w:left="-5"/>
+        <w:rPr>
+          <w:sz w:val="24"/>
+          <w:szCs w:val="24"/>
+        </w:rPr>
+      </w:pPr>
+    </w:p>
+    <w:p>
+      <w:pPr>
+        <w:ind w:left="-5"/>
+        <w:rPr>
+          <w:sz w:val="24"/>
+          <w:szCs w:val="24"/>
+        </w:rPr>
+      </w:pPr>
+      <w:r>
+        <w:rPr>
+          <w:sz w:val="24"/>
+          <w:szCs w:val="24"/>
+        </w:rPr>
+        <w:t># TASK 5: MACHINE LEARNING</w:t>
+      </w:r>
+    </w:p>
+    <w:p>
+      <w:pPr>
+        <w:ind w:left="-5"/>
+        <w:rPr>
+          <w:sz w:val="24"/>
+          <w:szCs w:val="24"/>
+        </w:rPr>
+      </w:pPr>
+      <w:proofErr w:type="gramStart"/>
+      <w:r>
+        <w:rPr>
+          <w:sz w:val="24"/>
+          <w:szCs w:val="24"/>
+        </w:rPr>
+        <w:t>print(</w:t>
+      </w:r>
+      <w:proofErr w:type="gramEnd"/>
+      <w:r>
+        <w:rPr>
+          <w:sz w:val="24"/>
+          <w:szCs w:val="24"/>
+        </w:rPr>
+        <w:t>"TASK 5: MACHINE LEARNING - LOGISTIC REGRESSION")</w:t>
+      </w:r>
+    </w:p>
+    <w:p>
+      <w:pPr>
+        <w:ind w:left="-5"/>
+        <w:rPr>
+          <w:sz w:val="24"/>
+          <w:szCs w:val="24"/>
+        </w:rPr>
+      </w:pPr>
+    </w:p>
+    <w:p>
+      <w:pPr>
+        <w:ind w:left="-5"/>
+        <w:rPr>
+          <w:sz w:val="24"/>
+          <w:szCs w:val="24"/>
+        </w:rPr>
+      </w:pPr>
+      <w:proofErr w:type="spellStart"/>
+      <w:r>
+        <w:rPr>
+          <w:sz w:val="24"/>
+          <w:szCs w:val="24"/>
+        </w:rPr>
+        <w:t>ml_data</w:t>
+      </w:r>
+      <w:proofErr w:type="spellEnd"/>
+      <w:r>
+        <w:rPr>
+          <w:sz w:val="24"/>
+          <w:szCs w:val="24"/>
+        </w:rPr>
+        <w:t xml:space="preserve"> = </w:t>
+      </w:r>
+      <w:proofErr w:type="spellStart"/>
+      <w:proofErr w:type="gramStart"/>
+      <w:r>
+        <w:rPr>
+          <w:sz w:val="24"/>
+          <w:szCs w:val="24"/>
+        </w:rPr>
+        <w:t>data.copy</w:t>
+      </w:r>
+      <w:proofErr w:type="spellEnd"/>
+      <w:proofErr w:type="gramEnd"/>
+      <w:r>
+        <w:rPr>
+          <w:sz w:val="24"/>
+          <w:szCs w:val="24"/>
+        </w:rPr>
+        <w:t>()</w:t>
+      </w:r>
+    </w:p>
+    <w:p>
+      <w:pPr>
+        <w:ind w:left="-5"/>
+        <w:rPr>
+          <w:sz w:val="24"/>
+          <w:szCs w:val="24"/>
+        </w:rPr>
+      </w:pPr>
+      <w:proofErr w:type="spellStart"/>
+      <w:r>
+        <w:rPr>
+          <w:sz w:val="24"/>
+          <w:szCs w:val="24"/>
+        </w:rPr>
+        <w:t>ml_data</w:t>
+      </w:r>
+      <w:proofErr w:type="spellEnd"/>
+      <w:r>
+        <w:rPr>
+          <w:sz w:val="24"/>
+          <w:szCs w:val="24"/>
+        </w:rPr>
+        <w:t xml:space="preserve">['Sex'] = </w:t>
+      </w:r>
+      <w:proofErr w:type="spellStart"/>
+      <w:r>
+        <w:rPr>
+          <w:sz w:val="24"/>
+          <w:szCs w:val="24"/>
+        </w:rPr>
+        <w:t>ml_data</w:t>
+      </w:r>
+      <w:proofErr w:type="spellEnd"/>
+      <w:r>
+        <w:rPr>
+          <w:sz w:val="24"/>
+          <w:szCs w:val="24"/>
+        </w:rPr>
+        <w:t>['Sex'</w:t>
+      </w:r>
+      <w:proofErr w:type="gramStart"/>
+      <w:r>
+        <w:rPr>
+          <w:sz w:val="24"/>
+          <w:szCs w:val="24"/>
+        </w:rPr>
+        <w:t>].map</w:t>
+      </w:r>
+      <w:proofErr w:type="gramEnd"/>
+      <w:r>
+        <w:rPr>
+          <w:sz w:val="24"/>
+          <w:szCs w:val="24"/>
+        </w:rPr>
+        <w:t>({'male': 0, 'female': 1})</w:t>
+      </w:r>
+    </w:p>
+    <w:p>
+      <w:pPr>
+        <w:ind w:left="-5"/>
+        <w:rPr>
+          <w:sz w:val="24"/>
+          <w:szCs w:val="24"/>
+        </w:rPr>
+      </w:pPr>
+      <w:proofErr w:type="spellStart"/>
+      <w:r>
+        <w:rPr>
+          <w:sz w:val="24"/>
+          <w:szCs w:val="24"/>
+        </w:rPr>
         <w:lastRenderedPageBreak/>
-        <w:t>plt.xlabel</w:t>
-      </w:r>
-      <w:proofErr w:type="spellEnd"/>
-      <w:proofErr w:type="gramEnd"/>
-      <w:r>
-        <w:rPr>
-          <w:sz w:val="24"/>
-          <w:szCs w:val="24"/>
-        </w:rPr>
-        <w:t xml:space="preserve">("Passenger Class"); </w:t>
-      </w:r>
-      <w:proofErr w:type="spellStart"/>
-      <w:r>
-        <w:rPr>
-          <w:sz w:val="24"/>
-          <w:szCs w:val="24"/>
-        </w:rPr>
-        <w:t>plt.ylabel</w:t>
-      </w:r>
-      <w:proofErr w:type="spellEnd"/>
-      <w:r>
-        <w:rPr>
-          <w:sz w:val="24"/>
-          <w:szCs w:val="24"/>
-        </w:rPr>
-        <w:t>("Age")</w:t>
-      </w:r>
-    </w:p>
-    <w:p>
-      <w:pPr>
-        <w:ind w:left="-5"/>
-        <w:rPr>
-          <w:sz w:val="24"/>
-          <w:szCs w:val="24"/>
-        </w:rPr>
-      </w:pPr>
-      <w:proofErr w:type="spellStart"/>
-      <w:proofErr w:type="gramStart"/>
-      <w:r>
-        <w:rPr>
-          <w:sz w:val="24"/>
-          <w:szCs w:val="24"/>
-        </w:rPr>
-        <w:t>plt.tight</w:t>
-      </w:r>
-      <w:proofErr w:type="gramEnd"/>
-      <w:r>
-        <w:rPr>
-          <w:sz w:val="24"/>
-          <w:szCs w:val="24"/>
-        </w:rPr>
-        <w:t>_layout</w:t>
+        <w:t>ml_data</w:t>
+      </w:r>
+      <w:proofErr w:type="spellEnd"/>
+      <w:r>
+        <w:rPr>
+          <w:sz w:val="24"/>
+          <w:szCs w:val="24"/>
+        </w:rPr>
+        <w:t xml:space="preserve"> = </w:t>
+      </w:r>
+      <w:proofErr w:type="spellStart"/>
+      <w:r>
+        <w:rPr>
+          <w:sz w:val="24"/>
+          <w:szCs w:val="24"/>
+        </w:rPr>
+        <w:t>ml_</w:t>
+      </w:r>
+      <w:proofErr w:type="gramStart"/>
+      <w:r>
+        <w:rPr>
+          <w:sz w:val="24"/>
+          <w:szCs w:val="24"/>
+        </w:rPr>
+        <w:t>data</w:t>
+      </w:r>
+      <w:proofErr w:type="spellEnd"/>
+      <w:r>
+        <w:rPr>
+          <w:sz w:val="24"/>
+          <w:szCs w:val="24"/>
+        </w:rPr>
+        <w:t>[</w:t>
+      </w:r>
+      <w:proofErr w:type="gramEnd"/>
+      <w:r>
+        <w:rPr>
+          <w:sz w:val="24"/>
+          <w:szCs w:val="24"/>
+        </w:rPr>
+        <w:t>['Survived', '</w:t>
+      </w:r>
+      <w:proofErr w:type="spellStart"/>
+      <w:r>
+        <w:rPr>
+          <w:sz w:val="24"/>
+          <w:szCs w:val="24"/>
+        </w:rPr>
+        <w:t>Pclass</w:t>
+      </w:r>
+      <w:proofErr w:type="spellEnd"/>
+      <w:r>
+        <w:rPr>
+          <w:sz w:val="24"/>
+          <w:szCs w:val="24"/>
+        </w:rPr>
+        <w:t>', 'Sex', 'Age', '</w:t>
+      </w:r>
+      <w:proofErr w:type="spellStart"/>
+      <w:r>
+        <w:rPr>
+          <w:sz w:val="24"/>
+          <w:szCs w:val="24"/>
+        </w:rPr>
+        <w:t>SibSp</w:t>
+      </w:r>
+      <w:proofErr w:type="spellEnd"/>
+      <w:r>
+        <w:rPr>
+          <w:sz w:val="24"/>
+          <w:szCs w:val="24"/>
+        </w:rPr>
+        <w:t>', 'Parch', 'Fare']].</w:t>
+      </w:r>
+      <w:proofErr w:type="spellStart"/>
+      <w:r>
+        <w:rPr>
+          <w:sz w:val="24"/>
+          <w:szCs w:val="24"/>
+        </w:rPr>
+        <w:t>dropna</w:t>
       </w:r>
       <w:proofErr w:type="spellEnd"/>
       <w:r>
@@ -3221,1788 +4957,11 @@
           <w:szCs w:val="24"/>
         </w:rPr>
       </w:pPr>
-      <w:proofErr w:type="spellStart"/>
-      <w:proofErr w:type="gramStart"/>
-      <w:r>
-        <w:rPr>
-          <w:sz w:val="24"/>
-          <w:szCs w:val="24"/>
-        </w:rPr>
-        <w:t>plt.show</w:t>
-      </w:r>
-      <w:proofErr w:type="spellEnd"/>
-      <w:proofErr w:type="gramEnd"/>
-      <w:r>
-        <w:rPr>
-          <w:sz w:val="24"/>
-          <w:szCs w:val="24"/>
-        </w:rPr>
-        <w:t>()</w:t>
-      </w:r>
-    </w:p>
-    <w:p>
-      <w:pPr>
-        <w:ind w:left="-5"/>
-        <w:rPr>
-          <w:sz w:val="24"/>
-          <w:szCs w:val="24"/>
-        </w:rPr>
-      </w:pPr>
-      <w:proofErr w:type="gramStart"/>
-      <w:r>
-        <w:rPr>
-          <w:sz w:val="24"/>
-          <w:szCs w:val="24"/>
-        </w:rPr>
-        <w:t>print(</w:t>
-      </w:r>
-      <w:proofErr w:type="gramEnd"/>
-      <w:r>
-        <w:rPr>
-          <w:sz w:val="24"/>
-          <w:szCs w:val="24"/>
-        </w:rPr>
-        <w:t>" Interpretation: 1st Class passengers were generally older.")</w:t>
-      </w:r>
-    </w:p>
-    <w:p>
-      <w:pPr>
-        <w:ind w:left="-5"/>
-        <w:rPr>
-          <w:sz w:val="24"/>
-          <w:szCs w:val="24"/>
-        </w:rPr>
-      </w:pPr>
-    </w:p>
-    <w:p>
-      <w:pPr>
-        <w:ind w:left="-5"/>
-        <w:rPr>
-          <w:sz w:val="24"/>
-          <w:szCs w:val="24"/>
-        </w:rPr>
-      </w:pPr>
-      <w:r>
-        <w:rPr>
-          <w:sz w:val="24"/>
-          <w:szCs w:val="24"/>
-        </w:rPr>
-        <w:t># 4. Scatter</w:t>
-      </w:r>
-    </w:p>
-    <w:p>
-      <w:pPr>
-        <w:ind w:left="-5"/>
-        <w:rPr>
-          <w:sz w:val="24"/>
-          <w:szCs w:val="24"/>
-        </w:rPr>
-      </w:pPr>
-      <w:proofErr w:type="spellStart"/>
-      <w:proofErr w:type="gramStart"/>
-      <w:r>
-        <w:rPr>
-          <w:sz w:val="24"/>
-          <w:szCs w:val="24"/>
-        </w:rPr>
-        <w:t>plt.figure</w:t>
-      </w:r>
-      <w:proofErr w:type="spellEnd"/>
-      <w:proofErr w:type="gramEnd"/>
-      <w:r>
-        <w:rPr>
-          <w:sz w:val="24"/>
-          <w:szCs w:val="24"/>
-        </w:rPr>
-        <w:t>()</w:t>
-      </w:r>
-    </w:p>
-    <w:p>
-      <w:pPr>
-        <w:ind w:left="-5"/>
-        <w:rPr>
-          <w:sz w:val="24"/>
-          <w:szCs w:val="24"/>
-        </w:rPr>
-      </w:pPr>
-      <w:proofErr w:type="spellStart"/>
-      <w:proofErr w:type="gramStart"/>
-      <w:r>
-        <w:rPr>
-          <w:sz w:val="24"/>
-          <w:szCs w:val="24"/>
-        </w:rPr>
-        <w:t>sns.scatterplot</w:t>
-      </w:r>
-      <w:proofErr w:type="spellEnd"/>
-      <w:proofErr w:type="gramEnd"/>
-      <w:r>
-        <w:rPr>
-          <w:sz w:val="24"/>
-          <w:szCs w:val="24"/>
-        </w:rPr>
-        <w:t>(x='Age', y='Fare', hue='</w:t>
-      </w:r>
-      <w:proofErr w:type="spellStart"/>
-      <w:r>
-        <w:rPr>
-          <w:sz w:val="24"/>
-          <w:szCs w:val="24"/>
-        </w:rPr>
-        <w:t>Pclass</w:t>
-      </w:r>
-      <w:proofErr w:type="spellEnd"/>
-      <w:r>
-        <w:rPr>
-          <w:sz w:val="24"/>
-          <w:szCs w:val="24"/>
-        </w:rPr>
-        <w:t>', data=data, palette='</w:t>
-      </w:r>
-      <w:proofErr w:type="spellStart"/>
-      <w:r>
-        <w:rPr>
-          <w:sz w:val="24"/>
-          <w:szCs w:val="24"/>
-        </w:rPr>
-        <w:t>viridis</w:t>
-      </w:r>
-      <w:proofErr w:type="spellEnd"/>
-      <w:r>
-        <w:rPr>
-          <w:sz w:val="24"/>
-          <w:szCs w:val="24"/>
-        </w:rPr>
-        <w:t>', alpha=0.6)</w:t>
-      </w:r>
-    </w:p>
-    <w:p>
-      <w:pPr>
-        <w:ind w:left="-5"/>
-        <w:rPr>
-          <w:sz w:val="24"/>
-          <w:szCs w:val="24"/>
-        </w:rPr>
-      </w:pPr>
-      <w:proofErr w:type="spellStart"/>
-      <w:proofErr w:type="gramStart"/>
-      <w:r>
-        <w:rPr>
-          <w:sz w:val="24"/>
-          <w:szCs w:val="24"/>
-        </w:rPr>
-        <w:t>plt.title</w:t>
-      </w:r>
-      <w:proofErr w:type="spellEnd"/>
-      <w:proofErr w:type="gramEnd"/>
-      <w:r>
-        <w:rPr>
-          <w:sz w:val="24"/>
-          <w:szCs w:val="24"/>
-        </w:rPr>
-        <w:t>("Scatter Plot: Age vs Fare")</w:t>
-      </w:r>
-    </w:p>
-    <w:p>
-      <w:pPr>
-        <w:ind w:left="-5"/>
-        <w:rPr>
-          <w:sz w:val="24"/>
-          <w:szCs w:val="24"/>
-        </w:rPr>
-      </w:pPr>
-      <w:proofErr w:type="spellStart"/>
-      <w:proofErr w:type="gramStart"/>
-      <w:r>
-        <w:rPr>
-          <w:sz w:val="24"/>
-          <w:szCs w:val="24"/>
-        </w:rPr>
-        <w:t>plt.xlabel</w:t>
-      </w:r>
-      <w:proofErr w:type="spellEnd"/>
-      <w:proofErr w:type="gramEnd"/>
-      <w:r>
-        <w:rPr>
-          <w:sz w:val="24"/>
-          <w:szCs w:val="24"/>
-        </w:rPr>
-        <w:t xml:space="preserve">("Age"); </w:t>
-      </w:r>
-      <w:proofErr w:type="spellStart"/>
-      <w:r>
-        <w:rPr>
-          <w:sz w:val="24"/>
-          <w:szCs w:val="24"/>
-        </w:rPr>
-        <w:t>plt.ylabel</w:t>
-      </w:r>
-      <w:proofErr w:type="spellEnd"/>
-      <w:r>
-        <w:rPr>
-          <w:sz w:val="24"/>
-          <w:szCs w:val="24"/>
-        </w:rPr>
-        <w:t>("Fare")</w:t>
-      </w:r>
-    </w:p>
-    <w:p>
-      <w:pPr>
-        <w:ind w:left="-5"/>
-        <w:rPr>
-          <w:sz w:val="24"/>
-          <w:szCs w:val="24"/>
-        </w:rPr>
-      </w:pPr>
-      <w:proofErr w:type="spellStart"/>
-      <w:proofErr w:type="gramStart"/>
-      <w:r>
-        <w:rPr>
-          <w:sz w:val="24"/>
-          <w:szCs w:val="24"/>
-        </w:rPr>
-        <w:t>plt.tight</w:t>
-      </w:r>
-      <w:proofErr w:type="gramEnd"/>
-      <w:r>
-        <w:rPr>
-          <w:sz w:val="24"/>
-          <w:szCs w:val="24"/>
-        </w:rPr>
-        <w:t>_layout</w:t>
-      </w:r>
-      <w:proofErr w:type="spellEnd"/>
-      <w:r>
-        <w:rPr>
-          <w:sz w:val="24"/>
-          <w:szCs w:val="24"/>
-        </w:rPr>
-        <w:t>()</w:t>
-      </w:r>
-    </w:p>
-    <w:p>
-      <w:pPr>
-        <w:ind w:left="-5"/>
-        <w:rPr>
-          <w:sz w:val="24"/>
-          <w:szCs w:val="24"/>
-        </w:rPr>
-      </w:pPr>
-      <w:proofErr w:type="spellStart"/>
-      <w:proofErr w:type="gramStart"/>
-      <w:r>
-        <w:rPr>
-          <w:sz w:val="24"/>
-          <w:szCs w:val="24"/>
-        </w:rPr>
-        <w:t>plt.show</w:t>
-      </w:r>
-      <w:proofErr w:type="spellEnd"/>
-      <w:proofErr w:type="gramEnd"/>
-      <w:r>
-        <w:rPr>
-          <w:sz w:val="24"/>
-          <w:szCs w:val="24"/>
-        </w:rPr>
-        <w:t>()</w:t>
-      </w:r>
-    </w:p>
-    <w:p>
-      <w:pPr>
-        <w:ind w:left="-5"/>
-        <w:rPr>
-          <w:sz w:val="24"/>
-          <w:szCs w:val="24"/>
-        </w:rPr>
-      </w:pPr>
-      <w:proofErr w:type="gramStart"/>
-      <w:r>
-        <w:rPr>
-          <w:sz w:val="24"/>
-          <w:szCs w:val="24"/>
-        </w:rPr>
-        <w:t>print(</w:t>
-      </w:r>
-      <w:proofErr w:type="gramEnd"/>
-      <w:r>
-        <w:rPr>
-          <w:sz w:val="24"/>
-          <w:szCs w:val="24"/>
-        </w:rPr>
-        <w:t>" Interpretation: Higher fares were paid by 1st Class passengers.")</w:t>
-      </w:r>
-    </w:p>
-    <w:p>
-      <w:pPr>
-        <w:ind w:left="-5"/>
-        <w:rPr>
-          <w:sz w:val="24"/>
-          <w:szCs w:val="24"/>
-        </w:rPr>
-      </w:pPr>
-    </w:p>
-    <w:p>
-      <w:pPr>
-        <w:ind w:left="-5"/>
-        <w:rPr>
-          <w:sz w:val="24"/>
-          <w:szCs w:val="24"/>
-        </w:rPr>
-      </w:pPr>
-      <w:r>
-        <w:rPr>
-          <w:sz w:val="24"/>
-          <w:szCs w:val="24"/>
-        </w:rPr>
-        <w:t># 5. Heatmap</w:t>
-      </w:r>
-    </w:p>
-    <w:p>
-      <w:pPr>
-        <w:ind w:left="-5"/>
-        <w:rPr>
-          <w:sz w:val="24"/>
-          <w:szCs w:val="24"/>
-        </w:rPr>
-      </w:pPr>
-      <w:proofErr w:type="spellStart"/>
-      <w:r>
-        <w:rPr>
-          <w:sz w:val="24"/>
-          <w:szCs w:val="24"/>
-        </w:rPr>
-        <w:t>numeric_data</w:t>
-      </w:r>
-      <w:proofErr w:type="spellEnd"/>
-      <w:r>
-        <w:rPr>
-          <w:sz w:val="24"/>
-          <w:szCs w:val="24"/>
-        </w:rPr>
-        <w:t xml:space="preserve"> = </w:t>
-      </w:r>
-      <w:proofErr w:type="gramStart"/>
-      <w:r>
-        <w:rPr>
-          <w:sz w:val="24"/>
-          <w:szCs w:val="24"/>
-        </w:rPr>
-        <w:t>data[</w:t>
-      </w:r>
-      <w:proofErr w:type="gramEnd"/>
-      <w:r>
-        <w:rPr>
-          <w:sz w:val="24"/>
-          <w:szCs w:val="24"/>
-        </w:rPr>
-        <w:t>['Survived', '</w:t>
-      </w:r>
-      <w:proofErr w:type="spellStart"/>
-      <w:r>
-        <w:rPr>
-          <w:sz w:val="24"/>
-          <w:szCs w:val="24"/>
-        </w:rPr>
-        <w:t>Pclass</w:t>
-      </w:r>
-      <w:proofErr w:type="spellEnd"/>
-      <w:r>
-        <w:rPr>
-          <w:sz w:val="24"/>
-          <w:szCs w:val="24"/>
-        </w:rPr>
-        <w:t>', 'Age', '</w:t>
-      </w:r>
-      <w:proofErr w:type="spellStart"/>
-      <w:r>
-        <w:rPr>
-          <w:sz w:val="24"/>
-          <w:szCs w:val="24"/>
-        </w:rPr>
-        <w:t>SibSp</w:t>
-      </w:r>
-      <w:proofErr w:type="spellEnd"/>
-      <w:r>
-        <w:rPr>
-          <w:sz w:val="24"/>
-          <w:szCs w:val="24"/>
-        </w:rPr>
-        <w:t>', 'Parch', 'Fare']]</w:t>
-      </w:r>
-    </w:p>
-    <w:p>
-      <w:pPr>
-        <w:ind w:left="-5"/>
-        <w:rPr>
-          <w:sz w:val="24"/>
-          <w:szCs w:val="24"/>
-        </w:rPr>
-      </w:pPr>
-      <w:proofErr w:type="spellStart"/>
-      <w:proofErr w:type="gramStart"/>
-      <w:r>
-        <w:rPr>
-          <w:sz w:val="24"/>
-          <w:szCs w:val="24"/>
-        </w:rPr>
-        <w:t>plt.figure</w:t>
-      </w:r>
-      <w:proofErr w:type="spellEnd"/>
-      <w:proofErr w:type="gramEnd"/>
-      <w:r>
-        <w:rPr>
-          <w:sz w:val="24"/>
-          <w:szCs w:val="24"/>
-        </w:rPr>
-        <w:t>(</w:t>
-      </w:r>
-      <w:proofErr w:type="spellStart"/>
-      <w:r>
-        <w:rPr>
-          <w:sz w:val="24"/>
-          <w:szCs w:val="24"/>
-        </w:rPr>
-        <w:t>figsize</w:t>
-      </w:r>
-      <w:proofErr w:type="spellEnd"/>
-      <w:r>
-        <w:rPr>
-          <w:sz w:val="24"/>
-          <w:szCs w:val="24"/>
-        </w:rPr>
-        <w:t>=(7,5))</w:t>
-      </w:r>
-    </w:p>
-    <w:p>
-      <w:pPr>
-        <w:ind w:left="-5"/>
-        <w:rPr>
-          <w:sz w:val="24"/>
-          <w:szCs w:val="24"/>
-        </w:rPr>
-      </w:pPr>
-      <w:proofErr w:type="spellStart"/>
-      <w:proofErr w:type="gramStart"/>
-      <w:r>
-        <w:rPr>
-          <w:sz w:val="24"/>
-          <w:szCs w:val="24"/>
-        </w:rPr>
-        <w:t>sns.heatmap</w:t>
-      </w:r>
-      <w:proofErr w:type="spellEnd"/>
-      <w:proofErr w:type="gramEnd"/>
-      <w:r>
-        <w:rPr>
-          <w:sz w:val="24"/>
-          <w:szCs w:val="24"/>
-        </w:rPr>
-        <w:t>(</w:t>
-      </w:r>
-      <w:proofErr w:type="spellStart"/>
-      <w:r>
-        <w:rPr>
-          <w:sz w:val="24"/>
-          <w:szCs w:val="24"/>
-        </w:rPr>
-        <w:t>numeric_data.corr</w:t>
-      </w:r>
-      <w:proofErr w:type="spellEnd"/>
-      <w:r>
-        <w:rPr>
-          <w:sz w:val="24"/>
-          <w:szCs w:val="24"/>
-        </w:rPr>
-        <w:t xml:space="preserve">(), </w:t>
-      </w:r>
-      <w:proofErr w:type="spellStart"/>
-      <w:r>
-        <w:rPr>
-          <w:sz w:val="24"/>
-          <w:szCs w:val="24"/>
-        </w:rPr>
-        <w:t>annot</w:t>
-      </w:r>
-      <w:proofErr w:type="spellEnd"/>
-      <w:r>
-        <w:rPr>
-          <w:sz w:val="24"/>
-          <w:szCs w:val="24"/>
-        </w:rPr>
-        <w:t xml:space="preserve">=True, </w:t>
-      </w:r>
-      <w:proofErr w:type="spellStart"/>
-      <w:r>
-        <w:rPr>
-          <w:sz w:val="24"/>
-          <w:szCs w:val="24"/>
-        </w:rPr>
-        <w:t>cmap</w:t>
-      </w:r>
-      <w:proofErr w:type="spellEnd"/>
-      <w:r>
-        <w:rPr>
-          <w:sz w:val="24"/>
-          <w:szCs w:val="24"/>
-        </w:rPr>
-        <w:t>='</w:t>
-      </w:r>
-      <w:proofErr w:type="spellStart"/>
-      <w:r>
-        <w:rPr>
-          <w:sz w:val="24"/>
-          <w:szCs w:val="24"/>
-        </w:rPr>
-        <w:t>coolwarm</w:t>
-      </w:r>
-      <w:proofErr w:type="spellEnd"/>
-      <w:r>
-        <w:rPr>
-          <w:sz w:val="24"/>
-          <w:szCs w:val="24"/>
-        </w:rPr>
-        <w:t xml:space="preserve">', </w:t>
-      </w:r>
-      <w:proofErr w:type="spellStart"/>
-      <w:r>
-        <w:rPr>
-          <w:sz w:val="24"/>
-          <w:szCs w:val="24"/>
-        </w:rPr>
-        <w:t>fmt</w:t>
-      </w:r>
-      <w:proofErr w:type="spellEnd"/>
-      <w:r>
-        <w:rPr>
-          <w:sz w:val="24"/>
-          <w:szCs w:val="24"/>
-        </w:rPr>
-        <w:t>=".2f")</w:t>
-      </w:r>
-    </w:p>
-    <w:p>
-      <w:pPr>
-        <w:ind w:left="-5"/>
-        <w:rPr>
-          <w:sz w:val="24"/>
-          <w:szCs w:val="24"/>
-        </w:rPr>
-      </w:pPr>
-      <w:proofErr w:type="spellStart"/>
-      <w:proofErr w:type="gramStart"/>
-      <w:r>
-        <w:rPr>
-          <w:sz w:val="24"/>
-          <w:szCs w:val="24"/>
-        </w:rPr>
-        <w:t>plt.title</w:t>
-      </w:r>
-      <w:proofErr w:type="spellEnd"/>
-      <w:proofErr w:type="gramEnd"/>
-      <w:r>
-        <w:rPr>
-          <w:sz w:val="24"/>
-          <w:szCs w:val="24"/>
-        </w:rPr>
-        <w:t>("Correlation Heatmap")</w:t>
-      </w:r>
-    </w:p>
-    <w:p>
-      <w:pPr>
-        <w:ind w:left="-5"/>
-        <w:rPr>
-          <w:sz w:val="24"/>
-          <w:szCs w:val="24"/>
-        </w:rPr>
-      </w:pPr>
-      <w:proofErr w:type="spellStart"/>
-      <w:proofErr w:type="gramStart"/>
-      <w:r>
-        <w:rPr>
-          <w:sz w:val="24"/>
-          <w:szCs w:val="24"/>
-        </w:rPr>
-        <w:t>plt.tight</w:t>
-      </w:r>
-      <w:proofErr w:type="gramEnd"/>
-      <w:r>
-        <w:rPr>
-          <w:sz w:val="24"/>
-          <w:szCs w:val="24"/>
-        </w:rPr>
-        <w:t>_layout</w:t>
-      </w:r>
-      <w:proofErr w:type="spellEnd"/>
-      <w:r>
-        <w:rPr>
-          <w:sz w:val="24"/>
-          <w:szCs w:val="24"/>
-        </w:rPr>
-        <w:t>()</w:t>
-      </w:r>
-    </w:p>
-    <w:p>
-      <w:pPr>
-        <w:ind w:left="-5"/>
-        <w:rPr>
-          <w:sz w:val="24"/>
-          <w:szCs w:val="24"/>
-        </w:rPr>
-      </w:pPr>
-      <w:proofErr w:type="spellStart"/>
-      <w:proofErr w:type="gramStart"/>
-      <w:r>
-        <w:rPr>
-          <w:sz w:val="24"/>
-          <w:szCs w:val="24"/>
-        </w:rPr>
-        <w:t>plt.show</w:t>
-      </w:r>
-      <w:proofErr w:type="spellEnd"/>
-      <w:proofErr w:type="gramEnd"/>
-      <w:r>
-        <w:rPr>
-          <w:sz w:val="24"/>
-          <w:szCs w:val="24"/>
-        </w:rPr>
-        <w:t>()</w:t>
-      </w:r>
-    </w:p>
-    <w:p>
-      <w:pPr>
-        <w:ind w:left="-5"/>
-        <w:rPr>
-          <w:sz w:val="24"/>
-          <w:szCs w:val="24"/>
-        </w:rPr>
-      </w:pPr>
-    </w:p>
-    <w:p>
-      <w:pPr>
-        <w:ind w:left="-5"/>
-        <w:rPr>
-          <w:sz w:val="24"/>
-          <w:szCs w:val="24"/>
-        </w:rPr>
-      </w:pPr>
-      <w:r>
-        <w:rPr>
-          <w:sz w:val="24"/>
-          <w:szCs w:val="24"/>
-        </w:rPr>
-        <w:t xml:space="preserve"># 6. </w:t>
-      </w:r>
-      <w:proofErr w:type="spellStart"/>
-      <w:r>
-        <w:rPr>
-          <w:sz w:val="24"/>
-          <w:szCs w:val="24"/>
-        </w:rPr>
-        <w:t>Pairplot</w:t>
-      </w:r>
-      <w:proofErr w:type="spellEnd"/>
-    </w:p>
-    <w:p>
-      <w:pPr>
-        <w:ind w:left="-5"/>
-        <w:rPr>
-          <w:sz w:val="24"/>
-          <w:szCs w:val="24"/>
-        </w:rPr>
-      </w:pPr>
-      <w:proofErr w:type="spellStart"/>
-      <w:proofErr w:type="gramStart"/>
-      <w:r>
-        <w:rPr>
-          <w:sz w:val="24"/>
-          <w:szCs w:val="24"/>
-        </w:rPr>
-        <w:t>sns.pairplot</w:t>
-      </w:r>
-      <w:proofErr w:type="spellEnd"/>
-      <w:proofErr w:type="gramEnd"/>
-      <w:r>
-        <w:rPr>
-          <w:sz w:val="24"/>
-          <w:szCs w:val="24"/>
-        </w:rPr>
-        <w:t>(</w:t>
-      </w:r>
-      <w:proofErr w:type="spellStart"/>
-      <w:r>
-        <w:rPr>
-          <w:sz w:val="24"/>
-          <w:szCs w:val="24"/>
-        </w:rPr>
-        <w:t>numeric_data</w:t>
-      </w:r>
-      <w:proofErr w:type="spellEnd"/>
-      <w:r>
-        <w:rPr>
-          <w:sz w:val="24"/>
-          <w:szCs w:val="24"/>
-        </w:rPr>
-        <w:t>)</w:t>
-      </w:r>
-    </w:p>
-    <w:p>
-      <w:pPr>
-        <w:ind w:left="-5"/>
-        <w:rPr>
-          <w:sz w:val="24"/>
-          <w:szCs w:val="24"/>
-        </w:rPr>
-      </w:pPr>
-      <w:proofErr w:type="spellStart"/>
-      <w:proofErr w:type="gramStart"/>
-      <w:r>
-        <w:rPr>
-          <w:sz w:val="24"/>
-          <w:szCs w:val="24"/>
-        </w:rPr>
-        <w:t>plt.suptitle</w:t>
-      </w:r>
-      <w:proofErr w:type="spellEnd"/>
-      <w:proofErr w:type="gramEnd"/>
-      <w:r>
-        <w:rPr>
-          <w:sz w:val="24"/>
-          <w:szCs w:val="24"/>
-        </w:rPr>
-        <w:t>("</w:t>
-      </w:r>
-      <w:proofErr w:type="spellStart"/>
-      <w:r>
-        <w:rPr>
-          <w:sz w:val="24"/>
-          <w:szCs w:val="24"/>
-        </w:rPr>
-        <w:t>Pairplot</w:t>
-      </w:r>
-      <w:proofErr w:type="spellEnd"/>
-      <w:r>
-        <w:rPr>
-          <w:sz w:val="24"/>
-          <w:szCs w:val="24"/>
-        </w:rPr>
-        <w:t xml:space="preserve"> of Numerical Variables", y=1.02)</w:t>
-      </w:r>
-    </w:p>
-    <w:p>
-      <w:pPr>
-        <w:ind w:left="-5"/>
-        <w:rPr>
-          <w:sz w:val="24"/>
-          <w:szCs w:val="24"/>
-        </w:rPr>
-      </w:pPr>
-      <w:proofErr w:type="spellStart"/>
-      <w:proofErr w:type="gramStart"/>
-      <w:r>
-        <w:rPr>
-          <w:sz w:val="24"/>
-          <w:szCs w:val="24"/>
-        </w:rPr>
-        <w:t>plt.show</w:t>
-      </w:r>
-      <w:proofErr w:type="spellEnd"/>
-      <w:proofErr w:type="gramEnd"/>
-      <w:r>
-        <w:rPr>
-          <w:sz w:val="24"/>
-          <w:szCs w:val="24"/>
-        </w:rPr>
-        <w:t>()</w:t>
-      </w:r>
-    </w:p>
-    <w:p>
-      <w:pPr>
-        <w:ind w:left="-5"/>
-        <w:rPr>
-          <w:sz w:val="24"/>
-          <w:szCs w:val="24"/>
-        </w:rPr>
-      </w:pPr>
-    </w:p>
-    <w:p>
-      <w:pPr>
-        <w:ind w:left="-5"/>
-        <w:rPr>
-          <w:sz w:val="24"/>
-          <w:szCs w:val="24"/>
-        </w:rPr>
-      </w:pPr>
-    </w:p>
-    <w:p>
-      <w:pPr>
-        <w:ind w:left="-5"/>
-        <w:rPr>
-          <w:sz w:val="24"/>
-          <w:szCs w:val="24"/>
-        </w:rPr>
-      </w:pPr>
-      <w:r>
-        <w:rPr>
-          <w:sz w:val="24"/>
-          <w:szCs w:val="24"/>
-        </w:rPr>
-        <w:t># TASK 4: STATISTICAL ANALYSIS</w:t>
-      </w:r>
-    </w:p>
-    <w:p>
-      <w:pPr>
-        <w:ind w:left="-5"/>
-        <w:rPr>
-          <w:sz w:val="24"/>
-          <w:szCs w:val="24"/>
-        </w:rPr>
-      </w:pPr>
-      <w:proofErr w:type="gramStart"/>
-      <w:r>
-        <w:rPr>
-          <w:sz w:val="24"/>
-          <w:szCs w:val="24"/>
-        </w:rPr>
-        <w:t>print(</w:t>
-      </w:r>
-      <w:proofErr w:type="gramEnd"/>
-      <w:r>
-        <w:rPr>
-          <w:sz w:val="24"/>
-          <w:szCs w:val="24"/>
-        </w:rPr>
-        <w:t>"TASK 4: STATISTICAL ANALYSIS")</w:t>
-      </w:r>
-    </w:p>
-    <w:p>
-      <w:pPr>
-        <w:ind w:left="-5"/>
-        <w:rPr>
-          <w:sz w:val="24"/>
-          <w:szCs w:val="24"/>
-        </w:rPr>
-      </w:pPr>
-      <w:proofErr w:type="gramStart"/>
-      <w:r>
-        <w:rPr>
-          <w:sz w:val="24"/>
-          <w:szCs w:val="24"/>
-        </w:rPr>
-        <w:t>print(</w:t>
-      </w:r>
-      <w:proofErr w:type="gramEnd"/>
-      <w:r>
-        <w:rPr>
-          <w:sz w:val="24"/>
-          <w:szCs w:val="24"/>
-        </w:rPr>
-        <w:t>"\n1. Descriptive Statistics:")</w:t>
-      </w:r>
-    </w:p>
-    <w:p>
-      <w:pPr>
-        <w:ind w:left="-5"/>
-        <w:rPr>
-          <w:sz w:val="24"/>
-          <w:szCs w:val="24"/>
-        </w:rPr>
-      </w:pPr>
-      <w:r>
-        <w:rPr>
-          <w:sz w:val="24"/>
-          <w:szCs w:val="24"/>
-        </w:rPr>
-        <w:t>print(</w:t>
-      </w:r>
-      <w:proofErr w:type="spellStart"/>
-      <w:r>
-        <w:rPr>
-          <w:sz w:val="24"/>
-          <w:szCs w:val="24"/>
-        </w:rPr>
-        <w:t>numeric_</w:t>
-      </w:r>
-      <w:proofErr w:type="gramStart"/>
-      <w:r>
-        <w:rPr>
-          <w:sz w:val="24"/>
-          <w:szCs w:val="24"/>
-        </w:rPr>
-        <w:t>data.describe</w:t>
-      </w:r>
-      <w:proofErr w:type="spellEnd"/>
-      <w:proofErr w:type="gramEnd"/>
-      <w:r>
-        <w:rPr>
-          <w:sz w:val="24"/>
-          <w:szCs w:val="24"/>
-        </w:rPr>
-        <w:t>().round(2))</w:t>
-      </w:r>
-    </w:p>
-    <w:p>
-      <w:pPr>
-        <w:ind w:left="-5"/>
-        <w:rPr>
-          <w:sz w:val="24"/>
-          <w:szCs w:val="24"/>
-        </w:rPr>
-      </w:pPr>
-      <w:proofErr w:type="gramStart"/>
-      <w:r>
-        <w:rPr>
-          <w:sz w:val="24"/>
-          <w:szCs w:val="24"/>
-        </w:rPr>
-        <w:t>print(</w:t>
-      </w:r>
-      <w:proofErr w:type="gramEnd"/>
-      <w:r>
-        <w:rPr>
-          <w:sz w:val="24"/>
-          <w:szCs w:val="24"/>
-        </w:rPr>
-        <w:t>"\n2. Frequency Distribution:")</w:t>
-      </w:r>
-    </w:p>
-    <w:p>
-      <w:pPr>
-        <w:ind w:left="-5"/>
-        <w:rPr>
-          <w:sz w:val="24"/>
-          <w:szCs w:val="24"/>
-        </w:rPr>
-      </w:pPr>
-      <w:proofErr w:type="gramStart"/>
-      <w:r>
-        <w:rPr>
-          <w:sz w:val="24"/>
-          <w:szCs w:val="24"/>
-        </w:rPr>
-        <w:t>print(</w:t>
-      </w:r>
-      <w:proofErr w:type="gramEnd"/>
-      <w:r>
-        <w:rPr>
-          <w:sz w:val="24"/>
-          <w:szCs w:val="24"/>
-        </w:rPr>
-        <w:t>"Survival:\n", data['Survived'].</w:t>
-      </w:r>
-      <w:proofErr w:type="spellStart"/>
-      <w:r>
-        <w:rPr>
-          <w:sz w:val="24"/>
-          <w:szCs w:val="24"/>
-        </w:rPr>
-        <w:t>value_counts</w:t>
-      </w:r>
-      <w:proofErr w:type="spellEnd"/>
-      <w:r>
-        <w:rPr>
-          <w:sz w:val="24"/>
-          <w:szCs w:val="24"/>
-        </w:rPr>
-        <w:t>())</w:t>
-      </w:r>
-    </w:p>
-    <w:p>
-      <w:pPr>
-        <w:ind w:left="-5"/>
-        <w:rPr>
-          <w:sz w:val="24"/>
-          <w:szCs w:val="24"/>
-        </w:rPr>
-      </w:pPr>
-      <w:proofErr w:type="gramStart"/>
-      <w:r>
-        <w:rPr>
-          <w:sz w:val="24"/>
-          <w:szCs w:val="24"/>
-        </w:rPr>
-        <w:t>print(</w:t>
-      </w:r>
-      <w:proofErr w:type="gramEnd"/>
-      <w:r>
-        <w:rPr>
-          <w:sz w:val="24"/>
-          <w:szCs w:val="24"/>
-        </w:rPr>
-        <w:t>"\</w:t>
-      </w:r>
-      <w:proofErr w:type="spellStart"/>
-      <w:r>
-        <w:rPr>
-          <w:sz w:val="24"/>
-          <w:szCs w:val="24"/>
-        </w:rPr>
-        <w:t>nPclass</w:t>
-      </w:r>
-      <w:proofErr w:type="spellEnd"/>
-      <w:r>
-        <w:rPr>
-          <w:sz w:val="24"/>
-          <w:szCs w:val="24"/>
-        </w:rPr>
-        <w:t>:\n", data['</w:t>
-      </w:r>
-      <w:proofErr w:type="spellStart"/>
-      <w:r>
-        <w:rPr>
-          <w:sz w:val="24"/>
-          <w:szCs w:val="24"/>
-        </w:rPr>
-        <w:t>Pclass</w:t>
-      </w:r>
-      <w:proofErr w:type="spellEnd"/>
-      <w:r>
-        <w:rPr>
-          <w:sz w:val="24"/>
-          <w:szCs w:val="24"/>
-        </w:rPr>
-        <w:t>'].</w:t>
-      </w:r>
-      <w:proofErr w:type="spellStart"/>
-      <w:r>
-        <w:rPr>
-          <w:sz w:val="24"/>
-          <w:szCs w:val="24"/>
-        </w:rPr>
-        <w:t>value_counts</w:t>
-      </w:r>
-      <w:proofErr w:type="spellEnd"/>
-      <w:r>
-        <w:rPr>
-          <w:sz w:val="24"/>
-          <w:szCs w:val="24"/>
-        </w:rPr>
-        <w:t>().</w:t>
-      </w:r>
-      <w:proofErr w:type="spellStart"/>
-      <w:r>
-        <w:rPr>
-          <w:sz w:val="24"/>
-          <w:szCs w:val="24"/>
-        </w:rPr>
-        <w:t>sort_index</w:t>
-      </w:r>
-      <w:proofErr w:type="spellEnd"/>
-      <w:r>
-        <w:rPr>
-          <w:sz w:val="24"/>
-          <w:szCs w:val="24"/>
-        </w:rPr>
-        <w:t>())</w:t>
-      </w:r>
-    </w:p>
-    <w:p>
-      <w:pPr>
-        <w:ind w:left="-5"/>
-        <w:rPr>
-          <w:sz w:val="24"/>
-          <w:szCs w:val="24"/>
-        </w:rPr>
-      </w:pPr>
-      <w:proofErr w:type="gramStart"/>
-      <w:r>
-        <w:rPr>
-          <w:sz w:val="24"/>
-          <w:szCs w:val="24"/>
-        </w:rPr>
-        <w:t>print(</w:t>
-      </w:r>
-      <w:proofErr w:type="gramEnd"/>
-      <w:r>
-        <w:rPr>
-          <w:sz w:val="24"/>
-          <w:szCs w:val="24"/>
-        </w:rPr>
-        <w:t>"\</w:t>
-      </w:r>
-      <w:proofErr w:type="spellStart"/>
-      <w:r>
-        <w:rPr>
-          <w:sz w:val="24"/>
-          <w:szCs w:val="24"/>
-        </w:rPr>
-        <w:t>nSex</w:t>
-      </w:r>
-      <w:proofErr w:type="spellEnd"/>
-      <w:r>
-        <w:rPr>
-          <w:sz w:val="24"/>
-          <w:szCs w:val="24"/>
-        </w:rPr>
-        <w:t>:\n", data['Sex'].</w:t>
-      </w:r>
-      <w:proofErr w:type="spellStart"/>
-      <w:r>
-        <w:rPr>
-          <w:sz w:val="24"/>
-          <w:szCs w:val="24"/>
-        </w:rPr>
-        <w:t>value_counts</w:t>
-      </w:r>
-      <w:proofErr w:type="spellEnd"/>
-      <w:r>
-        <w:rPr>
-          <w:sz w:val="24"/>
-          <w:szCs w:val="24"/>
-        </w:rPr>
-        <w:t>())</w:t>
-      </w:r>
-    </w:p>
-    <w:p>
-      <w:pPr>
-        <w:ind w:left="-5"/>
-        <w:rPr>
-          <w:sz w:val="24"/>
-          <w:szCs w:val="24"/>
-        </w:rPr>
-      </w:pPr>
-      <w:proofErr w:type="gramStart"/>
-      <w:r>
-        <w:rPr>
-          <w:sz w:val="24"/>
-          <w:szCs w:val="24"/>
-        </w:rPr>
-        <w:t>print(</w:t>
-      </w:r>
-      <w:proofErr w:type="gramEnd"/>
-      <w:r>
-        <w:rPr>
-          <w:sz w:val="24"/>
-          <w:szCs w:val="24"/>
-        </w:rPr>
-        <w:t>"\n3. Correlation Matrix:")</w:t>
-      </w:r>
-    </w:p>
-    <w:p>
-      <w:pPr>
-        <w:ind w:left="-5"/>
-        <w:rPr>
-          <w:sz w:val="24"/>
-          <w:szCs w:val="24"/>
-        </w:rPr>
-      </w:pPr>
-      <w:r>
-        <w:rPr>
-          <w:sz w:val="24"/>
-          <w:szCs w:val="24"/>
-        </w:rPr>
-        <w:t>print(</w:t>
-      </w:r>
-      <w:proofErr w:type="spellStart"/>
-      <w:r>
-        <w:rPr>
-          <w:sz w:val="24"/>
-          <w:szCs w:val="24"/>
-        </w:rPr>
-        <w:t>numeric_</w:t>
-      </w:r>
-      <w:proofErr w:type="gramStart"/>
-      <w:r>
-        <w:rPr>
-          <w:sz w:val="24"/>
-          <w:szCs w:val="24"/>
-        </w:rPr>
-        <w:t>data.corr</w:t>
-      </w:r>
-      <w:proofErr w:type="spellEnd"/>
-      <w:proofErr w:type="gramEnd"/>
-      <w:r>
-        <w:rPr>
-          <w:sz w:val="24"/>
-          <w:szCs w:val="24"/>
-        </w:rPr>
-        <w:t>().round(2))</w:t>
-      </w:r>
-    </w:p>
-    <w:p>
-      <w:pPr>
-        <w:ind w:left="-5"/>
-        <w:rPr>
-          <w:sz w:val="24"/>
-          <w:szCs w:val="24"/>
-        </w:rPr>
-      </w:pPr>
-      <w:proofErr w:type="spellStart"/>
-      <w:r>
-        <w:rPr>
-          <w:sz w:val="24"/>
-          <w:szCs w:val="24"/>
-        </w:rPr>
-        <w:t>corr</w:t>
-      </w:r>
-      <w:proofErr w:type="spellEnd"/>
-      <w:r>
-        <w:rPr>
-          <w:sz w:val="24"/>
-          <w:szCs w:val="24"/>
-        </w:rPr>
-        <w:t xml:space="preserve"> = </w:t>
-      </w:r>
-      <w:proofErr w:type="spellStart"/>
-      <w:r>
-        <w:rPr>
-          <w:sz w:val="24"/>
-          <w:szCs w:val="24"/>
-        </w:rPr>
-        <w:t>numeric_</w:t>
-      </w:r>
-      <w:proofErr w:type="gramStart"/>
-      <w:r>
-        <w:rPr>
-          <w:sz w:val="24"/>
-          <w:szCs w:val="24"/>
-        </w:rPr>
-        <w:t>data.corr</w:t>
-      </w:r>
-      <w:proofErr w:type="spellEnd"/>
-      <w:proofErr w:type="gramEnd"/>
-      <w:r>
-        <w:rPr>
-          <w:sz w:val="24"/>
-          <w:szCs w:val="24"/>
-        </w:rPr>
-        <w:t>()</w:t>
-      </w:r>
-    </w:p>
-    <w:p>
-      <w:pPr>
-        <w:ind w:left="-5"/>
-        <w:rPr>
-          <w:sz w:val="24"/>
-          <w:szCs w:val="24"/>
-        </w:rPr>
-      </w:pPr>
-      <w:proofErr w:type="gramStart"/>
-      <w:r>
-        <w:rPr>
-          <w:sz w:val="24"/>
-          <w:szCs w:val="24"/>
-        </w:rPr>
-        <w:t>print(</w:t>
-      </w:r>
-      <w:proofErr w:type="gramEnd"/>
-      <w:r>
-        <w:rPr>
-          <w:sz w:val="24"/>
-          <w:szCs w:val="24"/>
-        </w:rPr>
-        <w:t xml:space="preserve">"\n4. Strongest Positive Correlation:", </w:t>
-      </w:r>
-      <w:proofErr w:type="spellStart"/>
-      <w:r>
-        <w:rPr>
-          <w:sz w:val="24"/>
-          <w:szCs w:val="24"/>
-        </w:rPr>
-        <w:t>corr.abs</w:t>
-      </w:r>
-      <w:proofErr w:type="spellEnd"/>
-      <w:r>
-        <w:rPr>
-          <w:sz w:val="24"/>
-          <w:szCs w:val="24"/>
-        </w:rPr>
-        <w:t>(</w:t>
-      </w:r>
-      <w:proofErr w:type="gramStart"/>
-      <w:r>
-        <w:rPr>
-          <w:sz w:val="24"/>
-          <w:szCs w:val="24"/>
-        </w:rPr>
-        <w:t>).unstack</w:t>
-      </w:r>
-      <w:proofErr w:type="gramEnd"/>
-      <w:r>
-        <w:rPr>
-          <w:sz w:val="24"/>
-          <w:szCs w:val="24"/>
-        </w:rPr>
-        <w:t>().</w:t>
-      </w:r>
-      <w:proofErr w:type="spellStart"/>
-      <w:r>
-        <w:rPr>
-          <w:sz w:val="24"/>
-          <w:szCs w:val="24"/>
-        </w:rPr>
-        <w:t>sort_values</w:t>
-      </w:r>
-      <w:proofErr w:type="spellEnd"/>
-      <w:r>
-        <w:rPr>
-          <w:sz w:val="24"/>
-          <w:szCs w:val="24"/>
-        </w:rPr>
-        <w:t>(ascending=False)[1:2])</w:t>
-      </w:r>
-    </w:p>
-    <w:p>
-      <w:pPr>
-        <w:ind w:left="-5"/>
-        <w:rPr>
-          <w:sz w:val="24"/>
-          <w:szCs w:val="24"/>
-        </w:rPr>
-      </w:pPr>
-      <w:proofErr w:type="gramStart"/>
-      <w:r>
-        <w:rPr>
-          <w:sz w:val="24"/>
-          <w:szCs w:val="24"/>
-        </w:rPr>
-        <w:t>print(</w:t>
-      </w:r>
-      <w:proofErr w:type="gramEnd"/>
-      <w:r>
-        <w:rPr>
-          <w:sz w:val="24"/>
-          <w:szCs w:val="24"/>
-        </w:rPr>
-        <w:t xml:space="preserve">"\n5. Strongest Negative Correlation:", </w:t>
-      </w:r>
-      <w:proofErr w:type="spellStart"/>
-      <w:proofErr w:type="gramStart"/>
-      <w:r>
-        <w:rPr>
-          <w:sz w:val="24"/>
-          <w:szCs w:val="24"/>
-        </w:rPr>
-        <w:t>corr.unstack</w:t>
-      </w:r>
-      <w:proofErr w:type="spellEnd"/>
-      <w:proofErr w:type="gramEnd"/>
-      <w:r>
-        <w:rPr>
-          <w:sz w:val="24"/>
-          <w:szCs w:val="24"/>
-        </w:rPr>
-        <w:t>().</w:t>
-      </w:r>
-      <w:proofErr w:type="spellStart"/>
-      <w:r>
-        <w:rPr>
-          <w:sz w:val="24"/>
-          <w:szCs w:val="24"/>
-        </w:rPr>
-        <w:t>sort_values</w:t>
-      </w:r>
-      <w:proofErr w:type="spellEnd"/>
-      <w:r>
-        <w:rPr>
-          <w:sz w:val="24"/>
-          <w:szCs w:val="24"/>
-        </w:rPr>
-        <w:t>().head(1))</w:t>
-      </w:r>
-    </w:p>
-    <w:p>
-      <w:pPr>
-        <w:ind w:left="-5"/>
-        <w:rPr>
-          <w:sz w:val="24"/>
-          <w:szCs w:val="24"/>
-        </w:rPr>
-      </w:pPr>
-      <w:proofErr w:type="gramStart"/>
-      <w:r>
-        <w:rPr>
-          <w:sz w:val="24"/>
-          <w:szCs w:val="24"/>
-        </w:rPr>
-        <w:t>print(</w:t>
-      </w:r>
-      <w:proofErr w:type="gramEnd"/>
-      <w:r>
-        <w:rPr>
-          <w:sz w:val="24"/>
-          <w:szCs w:val="24"/>
-        </w:rPr>
-        <w:t>"\n6. Key Findings:")</w:t>
-      </w:r>
-    </w:p>
-    <w:p>
-      <w:pPr>
-        <w:ind w:left="-5"/>
-        <w:rPr>
-          <w:sz w:val="24"/>
-          <w:szCs w:val="24"/>
-        </w:rPr>
-      </w:pPr>
-      <w:proofErr w:type="gramStart"/>
-      <w:r>
-        <w:rPr>
-          <w:sz w:val="24"/>
-          <w:szCs w:val="24"/>
-        </w:rPr>
-        <w:t>print(</w:t>
-      </w:r>
-      <w:proofErr w:type="gramEnd"/>
-      <w:r>
-        <w:rPr>
-          <w:sz w:val="24"/>
-          <w:szCs w:val="24"/>
-        </w:rPr>
-        <w:t xml:space="preserve">"1. Strong correlation between </w:t>
-      </w:r>
-      <w:proofErr w:type="spellStart"/>
-      <w:r>
-        <w:rPr>
-          <w:sz w:val="24"/>
-          <w:szCs w:val="24"/>
-        </w:rPr>
-        <w:t>Pclass</w:t>
-      </w:r>
-      <w:proofErr w:type="spellEnd"/>
-      <w:r>
-        <w:rPr>
-          <w:sz w:val="24"/>
-          <w:szCs w:val="24"/>
-        </w:rPr>
-        <w:t xml:space="preserve"> and Fare.")</w:t>
-      </w:r>
-    </w:p>
-    <w:p>
-      <w:pPr>
-        <w:ind w:left="-5"/>
-        <w:rPr>
-          <w:sz w:val="24"/>
-          <w:szCs w:val="24"/>
-        </w:rPr>
-      </w:pPr>
-      <w:proofErr w:type="gramStart"/>
-      <w:r>
-        <w:rPr>
-          <w:sz w:val="24"/>
-          <w:szCs w:val="24"/>
-        </w:rPr>
-        <w:t>print(</w:t>
-      </w:r>
-      <w:proofErr w:type="gramEnd"/>
-      <w:r>
-        <w:rPr>
-          <w:sz w:val="24"/>
-          <w:szCs w:val="24"/>
-        </w:rPr>
-        <w:t>"2. Females and 1st Class had higher survival rates.")</w:t>
-      </w:r>
-    </w:p>
-    <w:p>
-      <w:pPr>
-        <w:ind w:left="-5"/>
-        <w:rPr>
-          <w:sz w:val="24"/>
-          <w:szCs w:val="24"/>
-        </w:rPr>
-      </w:pPr>
-      <w:proofErr w:type="gramStart"/>
-      <w:r>
-        <w:rPr>
-          <w:sz w:val="24"/>
-          <w:szCs w:val="24"/>
-        </w:rPr>
-        <w:t>print(</w:t>
-      </w:r>
-      <w:proofErr w:type="gramEnd"/>
-      <w:r>
-        <w:rPr>
-          <w:sz w:val="24"/>
-          <w:szCs w:val="24"/>
-        </w:rPr>
-        <w:t>"3. Most passengers were young adults.")</w:t>
-      </w:r>
-    </w:p>
-    <w:p>
-      <w:pPr>
-        <w:ind w:left="-5"/>
-        <w:rPr>
-          <w:sz w:val="24"/>
-          <w:szCs w:val="24"/>
-        </w:rPr>
-      </w:pPr>
-    </w:p>
-    <w:p>
-      <w:pPr>
-        <w:ind w:left="-5"/>
-        <w:rPr>
-          <w:sz w:val="24"/>
-          <w:szCs w:val="24"/>
-        </w:rPr>
-      </w:pPr>
-    </w:p>
-    <w:p>
-      <w:pPr>
-        <w:ind w:left="-5"/>
-        <w:rPr>
-          <w:sz w:val="24"/>
-          <w:szCs w:val="24"/>
-        </w:rPr>
-      </w:pPr>
-      <w:r>
-        <w:rPr>
-          <w:sz w:val="24"/>
-          <w:szCs w:val="24"/>
-        </w:rPr>
-        <w:t># TASK 5: MACHINE LEARNING</w:t>
-      </w:r>
-    </w:p>
-    <w:p>
-      <w:pPr>
-        <w:ind w:left="-5"/>
-        <w:rPr>
-          <w:sz w:val="24"/>
-          <w:szCs w:val="24"/>
-        </w:rPr>
-      </w:pPr>
-      <w:proofErr w:type="gramStart"/>
-      <w:r>
-        <w:rPr>
-          <w:sz w:val="24"/>
-          <w:szCs w:val="24"/>
-        </w:rPr>
-        <w:t>print(</w:t>
-      </w:r>
-      <w:proofErr w:type="gramEnd"/>
-      <w:r>
-        <w:rPr>
-          <w:sz w:val="24"/>
-          <w:szCs w:val="24"/>
-        </w:rPr>
-        <w:t>"TASK 5: MACHINE LEARNING - LOGISTIC REGRESSION")</w:t>
-      </w:r>
-    </w:p>
-    <w:p>
-      <w:pPr>
-        <w:ind w:left="-5"/>
-        <w:rPr>
-          <w:sz w:val="24"/>
-          <w:szCs w:val="24"/>
-        </w:rPr>
-      </w:pPr>
-    </w:p>
-    <w:p>
-      <w:pPr>
-        <w:ind w:left="-5"/>
-        <w:rPr>
-          <w:sz w:val="24"/>
-          <w:szCs w:val="24"/>
-        </w:rPr>
-      </w:pPr>
-      <w:proofErr w:type="spellStart"/>
-      <w:r>
-        <w:rPr>
-          <w:sz w:val="24"/>
-          <w:szCs w:val="24"/>
-        </w:rPr>
-        <w:t>ml_data</w:t>
-      </w:r>
-      <w:proofErr w:type="spellEnd"/>
-      <w:r>
-        <w:rPr>
-          <w:sz w:val="24"/>
-          <w:szCs w:val="24"/>
-        </w:rPr>
-        <w:t xml:space="preserve"> = </w:t>
-      </w:r>
-      <w:proofErr w:type="spellStart"/>
-      <w:proofErr w:type="gramStart"/>
-      <w:r>
-        <w:rPr>
-          <w:sz w:val="24"/>
-          <w:szCs w:val="24"/>
-        </w:rPr>
-        <w:t>data.copy</w:t>
-      </w:r>
-      <w:proofErr w:type="spellEnd"/>
-      <w:proofErr w:type="gramEnd"/>
-      <w:r>
-        <w:rPr>
-          <w:sz w:val="24"/>
-          <w:szCs w:val="24"/>
-        </w:rPr>
-        <w:t>()</w:t>
-      </w:r>
-    </w:p>
-    <w:p>
-      <w:pPr>
-        <w:ind w:left="-5"/>
-        <w:rPr>
-          <w:sz w:val="24"/>
-          <w:szCs w:val="24"/>
-        </w:rPr>
-      </w:pPr>
-      <w:proofErr w:type="spellStart"/>
-      <w:r>
-        <w:rPr>
-          <w:sz w:val="24"/>
-          <w:szCs w:val="24"/>
-        </w:rPr>
-        <w:t>ml_data</w:t>
-      </w:r>
-      <w:proofErr w:type="spellEnd"/>
-      <w:r>
-        <w:rPr>
-          <w:sz w:val="24"/>
-          <w:szCs w:val="24"/>
-        </w:rPr>
-        <w:t xml:space="preserve">['Sex'] = </w:t>
-      </w:r>
-      <w:proofErr w:type="spellStart"/>
-      <w:r>
-        <w:rPr>
-          <w:sz w:val="24"/>
-          <w:szCs w:val="24"/>
-        </w:rPr>
-        <w:t>ml_data</w:t>
-      </w:r>
-      <w:proofErr w:type="spellEnd"/>
-      <w:r>
-        <w:rPr>
-          <w:sz w:val="24"/>
-          <w:szCs w:val="24"/>
-        </w:rPr>
-        <w:t>['Sex'</w:t>
-      </w:r>
-      <w:proofErr w:type="gramStart"/>
-      <w:r>
-        <w:rPr>
-          <w:sz w:val="24"/>
-          <w:szCs w:val="24"/>
-        </w:rPr>
-        <w:t>].map</w:t>
-      </w:r>
-      <w:proofErr w:type="gramEnd"/>
-      <w:r>
-        <w:rPr>
-          <w:sz w:val="24"/>
-          <w:szCs w:val="24"/>
-        </w:rPr>
-        <w:t>({'male': 0, 'female': 1})</w:t>
-      </w:r>
-    </w:p>
-    <w:p>
-      <w:pPr>
-        <w:ind w:left="-5"/>
-        <w:rPr>
-          <w:sz w:val="24"/>
-          <w:szCs w:val="24"/>
-        </w:rPr>
-      </w:pPr>
-      <w:proofErr w:type="spellStart"/>
-      <w:r>
-        <w:rPr>
-          <w:sz w:val="24"/>
-          <w:szCs w:val="24"/>
-        </w:rPr>
-        <w:t>ml_data</w:t>
-      </w:r>
-      <w:proofErr w:type="spellEnd"/>
-      <w:r>
-        <w:rPr>
-          <w:sz w:val="24"/>
-          <w:szCs w:val="24"/>
-        </w:rPr>
-        <w:t xml:space="preserve"> = </w:t>
-      </w:r>
-      <w:proofErr w:type="spellStart"/>
-      <w:r>
-        <w:rPr>
-          <w:sz w:val="24"/>
-          <w:szCs w:val="24"/>
-        </w:rPr>
-        <w:t>ml_</w:t>
-      </w:r>
-      <w:proofErr w:type="gramStart"/>
-      <w:r>
-        <w:rPr>
-          <w:sz w:val="24"/>
-          <w:szCs w:val="24"/>
-        </w:rPr>
-        <w:t>data</w:t>
-      </w:r>
-      <w:proofErr w:type="spellEnd"/>
-      <w:r>
-        <w:rPr>
-          <w:sz w:val="24"/>
-          <w:szCs w:val="24"/>
-        </w:rPr>
-        <w:t>[</w:t>
-      </w:r>
-      <w:proofErr w:type="gramEnd"/>
-      <w:r>
-        <w:rPr>
-          <w:sz w:val="24"/>
-          <w:szCs w:val="24"/>
-        </w:rPr>
-        <w:t>['Survived', '</w:t>
-      </w:r>
-      <w:proofErr w:type="spellStart"/>
-      <w:r>
-        <w:rPr>
-          <w:sz w:val="24"/>
-          <w:szCs w:val="24"/>
-        </w:rPr>
-        <w:t>Pclass</w:t>
-      </w:r>
-      <w:proofErr w:type="spellEnd"/>
-      <w:r>
-        <w:rPr>
-          <w:sz w:val="24"/>
-          <w:szCs w:val="24"/>
-        </w:rPr>
-        <w:t>', 'Sex', 'Age', '</w:t>
-      </w:r>
-      <w:proofErr w:type="spellStart"/>
-      <w:r>
-        <w:rPr>
-          <w:sz w:val="24"/>
-          <w:szCs w:val="24"/>
-        </w:rPr>
-        <w:t>SibSp</w:t>
-      </w:r>
-      <w:proofErr w:type="spellEnd"/>
-      <w:r>
-        <w:rPr>
-          <w:sz w:val="24"/>
-          <w:szCs w:val="24"/>
-        </w:rPr>
-        <w:t>', 'Parch', 'Fare']].</w:t>
-      </w:r>
-      <w:proofErr w:type="spellStart"/>
-      <w:r>
-        <w:rPr>
-          <w:sz w:val="24"/>
-          <w:szCs w:val="24"/>
-        </w:rPr>
-        <w:t>dropna</w:t>
-      </w:r>
-      <w:proofErr w:type="spellEnd"/>
-      <w:r>
-        <w:rPr>
-          <w:sz w:val="24"/>
-          <w:szCs w:val="24"/>
-        </w:rPr>
-        <w:t>()</w:t>
-      </w:r>
-    </w:p>
-    <w:p>
-      <w:pPr>
-        <w:ind w:left="-5"/>
-        <w:rPr>
-          <w:sz w:val="24"/>
-          <w:szCs w:val="24"/>
-        </w:rPr>
-      </w:pPr>
-      <w:r>
-        <w:rPr>
-          <w:sz w:val="24"/>
-          <w:szCs w:val="24"/>
-        </w:rPr>
-        <w:lastRenderedPageBreak/>
+      <w:r>
+        <w:rPr>
+          <w:sz w:val="24"/>
+          <w:szCs w:val="24"/>
+        </w:rPr>
         <w:t xml:space="preserve">X = </w:t>
       </w:r>
       <w:proofErr w:type="spellStart"/>

</xml_diff>